<commit_message>
Update the Architecture and SRS to 1.2 for Word export and .obk files.
The Architecture adds ADR-012 (docx 9.14.0, MIT) for Word export and ADR-013 (yauzl 3.4.0 and yazl 3.3.1, MIT) for reading and writing .obk files, and updates the section 7 ADR table and the section 9 stack rows. Spike S-08 now covers the ZIP and hostile-file checks, and new spike S-09 checks that exported .docx files open correctly in Word. The SRS adds docx, JSZip, yauzl, and yazl to both license tables. The Markdown, Word, and PDF copies are all at 1.2. Docs only. No version bump.

Co-authored-by: Cursor Agent <cursoragent@cursor.com>
</commit_message>
<xml_diff>
--- a/docs/Plong_Obelisk_Architecture.docx
+++ b/docs/Plong_Obelisk_Architecture.docx
@@ -62,7 +62,7 @@
         <w:t xml:space="preserve">Date: </w:t>
       </w:r>
       <w:r>
-        <w:t>October 23, 2026</w:t>
+        <w:t>October 26, 2026</w:t>
       </w:r>
     </w:p>
     <w:p>
@@ -76,7 +76,7 @@
         <w:t xml:space="preserve">Version: </w:t>
       </w:r>
       <w:r>
-        <w:t>1.1</w:t>
+        <w:t>1.2</w:t>
       </w:r>
     </w:p>
     <w:p/>
@@ -175,7 +175,7 @@
       </w:r>
       <w:r>
         <w:tab/>
-        <w:t>4</w:t>
+        <w:t>5</w:t>
       </w:r>
     </w:p>
     <w:p>
@@ -235,7 +235,7 @@
       </w:r>
       <w:r>
         <w:tab/>
-        <w:t>26</w:t>
+        <w:t>27</w:t>
       </w:r>
     </w:p>
     <w:p>
@@ -250,7 +250,7 @@
       </w:r>
       <w:r>
         <w:tab/>
-        <w:t>26</w:t>
+        <w:t>28</w:t>
       </w:r>
     </w:p>
     <w:p>
@@ -265,7 +265,7 @@
       </w:r>
       <w:r>
         <w:tab/>
-        <w:t>28</w:t>
+        <w:t>30</w:t>
       </w:r>
     </w:p>
     <w:p>
@@ -280,7 +280,7 @@
       </w:r>
       <w:r>
         <w:tab/>
-        <w:t>31</w:t>
+        <w:t>33</w:t>
       </w:r>
     </w:p>
     <w:p>
@@ -295,7 +295,7 @@
       </w:r>
       <w:r>
         <w:tab/>
-        <w:t>32</w:t>
+        <w:t>34</w:t>
       </w:r>
     </w:p>
     <w:p>
@@ -477,6 +477,59 @@
           </w:p>
         </w:tc>
       </w:tr>
+      <w:tr>
+        <w:tc>
+          <w:tcPr>
+            <w:tcW w:type="dxa" w:w="1440"/>
+            <w:vAlign w:val="top"/>
+          </w:tcPr>
+          <w:p>
+            <w:pPr>
+              <w:spacing w:after="40"/>
+            </w:pPr>
+            <w:r>
+              <w:rPr>
+                <w:sz w:val="19"/>
+              </w:rPr>
+              <w:t>1.2</w:t>
+            </w:r>
+          </w:p>
+        </w:tc>
+        <w:tc>
+          <w:tcPr>
+            <w:tcW w:type="dxa" w:w="2304"/>
+            <w:vAlign w:val="top"/>
+          </w:tcPr>
+          <w:p>
+            <w:pPr>
+              <w:spacing w:after="40"/>
+            </w:pPr>
+            <w:r>
+              <w:rPr>
+                <w:sz w:val="19"/>
+              </w:rPr>
+              <w:t>October 26, 2026</w:t>
+            </w:r>
+          </w:p>
+        </w:tc>
+        <w:tc>
+          <w:tcPr>
+            <w:tcW w:type="dxa" w:w="5616"/>
+            <w:vAlign w:val="top"/>
+          </w:tcPr>
+          <w:p>
+            <w:pPr>
+              <w:spacing w:after="40"/>
+            </w:pPr>
+            <w:r>
+              <w:rPr>
+                <w:sz w:val="19"/>
+              </w:rPr>
+              <w:t>Added ADR-012 (docx for Word export) and ADR-013 (yauzl and yazl for .obk files). Set the Word file and ZIP rows in the stack table. Added spike S-09 and widened S-08. Based on SRS 1.2.</w:t>
+            </w:r>
+          </w:p>
+        </w:tc>
+      </w:tr>
     </w:tbl>
     <w:p>
       <w:pPr>
@@ -494,12 +547,12 @@
     </w:p>
     <w:p>
       <w:r>
-        <w:t>This document shows how Obelisk will meet its SRS. It cites requirement IDs from the SRS (Plong_Obelisk_SRS.docx, version 1.1) instead of repeating them.</w:t>
+        <w:t>This document shows how Obelisk will meet its SRS. It cites requirement IDs from the SRS (Plong_Obelisk_SRS.docx, version 1.2) instead of repeating them.</w:t>
       </w:r>
     </w:p>
     <w:p>
       <w:r>
-        <w:t>Everything here is a proposal until accepted. Technology versions are unverified until the spikes in section 9 confirm them.</w:t>
+        <w:t>Everything here is a proposal until accepted. Technology versions marked UNVERIFIED stay so until the spikes in section 9 confirm them.</w:t>
       </w:r>
     </w:p>
     <w:p>
@@ -704,7 +757,16 @@
         <w:spacing w:after="60"/>
       </w:pPr>
       <w:r>
-        <w:t>KaTeX for formulas; mathml2omml for Word equations (Should).</w:t>
+        <w:t>KaTeX for formulas; mathml2omml for Word equations (Should); docx for Word files (ADR-012).</w:t>
+      </w:r>
+    </w:p>
+    <w:p>
+      <w:pPr>
+        <w:pStyle w:val="ListBullet"/>
+        <w:spacing w:after="60"/>
+      </w:pPr>
+      <w:r>
+        <w:t>yauzl and yazl for reading and writing .obk files (ADR-013).</w:t>
       </w:r>
     </w:p>
     <w:p>
@@ -12458,7 +12520,7 @@
     </w:p>
     <w:p>
       <w:r>
-        <w:t>Decisions are based on SRS 1.1. They are Proposed until accepted; the two marked Accepted follow decisions made on October 23, 2026. Structure: ADR-001. Failure handling: ADR-002.</w:t>
+        <w:t>Decisions are based on SRS 1.2. They are Proposed until accepted. ADR-010 and ADR-011 were accepted on October 23, 2026, and ADR-012 and ADR-013 on October 26, 2026. Structure: ADR-001. Failure handling: ADR-002.</w:t>
       </w:r>
     </w:p>
     <w:tbl>
@@ -13105,6 +13167,112 @@
                 <w:sz w:val="19"/>
               </w:rPr>
               <w:t>Accepted 2026-10-23</w:t>
+            </w:r>
+          </w:p>
+        </w:tc>
+      </w:tr>
+      <w:tr>
+        <w:tc>
+          <w:tcPr>
+            <w:tcW w:type="dxa" w:w="1152"/>
+            <w:vAlign w:val="top"/>
+          </w:tcPr>
+          <w:p>
+            <w:pPr>
+              <w:spacing w:after="40"/>
+            </w:pPr>
+            <w:r>
+              <w:rPr>
+                <w:sz w:val="19"/>
+              </w:rPr>
+              <w:t>ADR-012</w:t>
+            </w:r>
+          </w:p>
+        </w:tc>
+        <w:tc>
+          <w:tcPr>
+            <w:tcW w:type="dxa" w:w="6624"/>
+            <w:vAlign w:val="top"/>
+          </w:tcPr>
+          <w:p>
+            <w:pPr>
+              <w:spacing w:after="40"/>
+            </w:pPr>
+            <w:r>
+              <w:rPr>
+                <w:sz w:val="19"/>
+              </w:rPr>
+              <w:t>Word export uses the docx library</w:t>
+            </w:r>
+          </w:p>
+        </w:tc>
+        <w:tc>
+          <w:tcPr>
+            <w:tcW w:type="dxa" w:w="1584"/>
+            <w:vAlign w:val="top"/>
+          </w:tcPr>
+          <w:p>
+            <w:pPr>
+              <w:spacing w:after="40"/>
+            </w:pPr>
+            <w:r>
+              <w:rPr>
+                <w:sz w:val="19"/>
+              </w:rPr>
+              <w:t>Accepted 2026-10-26</w:t>
+            </w:r>
+          </w:p>
+        </w:tc>
+      </w:tr>
+      <w:tr>
+        <w:tc>
+          <w:tcPr>
+            <w:tcW w:type="dxa" w:w="1152"/>
+            <w:vAlign w:val="top"/>
+          </w:tcPr>
+          <w:p>
+            <w:pPr>
+              <w:spacing w:after="40"/>
+            </w:pPr>
+            <w:r>
+              <w:rPr>
+                <w:sz w:val="19"/>
+              </w:rPr>
+              <w:t>ADR-013</w:t>
+            </w:r>
+          </w:p>
+        </w:tc>
+        <w:tc>
+          <w:tcPr>
+            <w:tcW w:type="dxa" w:w="6624"/>
+            <w:vAlign w:val="top"/>
+          </w:tcPr>
+          <w:p>
+            <w:pPr>
+              <w:spacing w:after="40"/>
+            </w:pPr>
+            <w:r>
+              <w:rPr>
+                <w:sz w:val="19"/>
+              </w:rPr>
+              <w:t>.obk files are read with yauzl and written with yazl</w:t>
+            </w:r>
+          </w:p>
+        </w:tc>
+        <w:tc>
+          <w:tcPr>
+            <w:tcW w:type="dxa" w:w="1584"/>
+            <w:vAlign w:val="top"/>
+          </w:tcPr>
+          <w:p>
+            <w:pPr>
+              <w:spacing w:after="40"/>
+            </w:pPr>
+            <w:r>
+              <w:rPr>
+                <w:sz w:val="19"/>
+              </w:rPr>
+              <w:t>Accepted 2026-10-26</w:t>
             </w:r>
           </w:p>
         </w:tc>
@@ -16163,6 +16331,845 @@
                 <w:sz w:val="20"/>
               </w:rPr>
               <w:t>A change cannot be written as a one-way conversion.</w:t>
+            </w:r>
+          </w:p>
+        </w:tc>
+      </w:tr>
+    </w:tbl>
+    <w:p>
+      <w:pPr>
+        <w:spacing w:after="40"/>
+      </w:pPr>
+    </w:p>
+    <w:p>
+      <w:pPr>
+        <w:pStyle w:val="Heading2"/>
+      </w:pPr>
+      <w:r>
+        <w:t>ADR-012 Word export uses the docx library</w:t>
+      </w:r>
+    </w:p>
+    <w:tbl>
+      <w:tblPr>
+        <w:tblStyle w:val="TableGrid"/>
+        <w:tblW w:type="auto" w:w="0"/>
+        <w:tblLayout w:type="fixed"/>
+        <w:tblLook w:firstColumn="1" w:firstRow="1" w:lastColumn="0" w:lastRow="0" w:noHBand="0" w:noVBand="1" w:val="04A0"/>
+      </w:tblPr>
+      <w:tblGrid>
+        <w:gridCol w:w="1872"/>
+        <w:gridCol w:w="7488"/>
+      </w:tblGrid>
+      <w:tr>
+        <w:trPr>
+          <w:tblHeader w:val="true"/>
+        </w:trPr>
+        <w:tc>
+          <w:tcPr>
+            <w:tcW w:type="dxa" w:w="1872"/>
+            <w:shd w:val="clear" w:color="auto" w:fill="D9E2F3"/>
+          </w:tcPr>
+          <w:p>
+            <w:r/>
+            <w:r>
+              <w:rPr>
+                <w:b/>
+                <w:sz w:val="20"/>
+              </w:rPr>
+              <w:t>Field</w:t>
+            </w:r>
+          </w:p>
+        </w:tc>
+        <w:tc>
+          <w:tcPr>
+            <w:tcW w:type="dxa" w:w="7488"/>
+            <w:shd w:val="clear" w:color="auto" w:fill="D9E2F3"/>
+          </w:tcPr>
+          <w:p>
+            <w:r/>
+            <w:r>
+              <w:rPr>
+                <w:b/>
+                <w:sz w:val="20"/>
+              </w:rPr>
+              <w:t>Content</w:t>
+            </w:r>
+          </w:p>
+        </w:tc>
+      </w:tr>
+      <w:tr>
+        <w:tc>
+          <w:tcPr>
+            <w:tcW w:type="dxa" w:w="1872"/>
+            <w:vAlign w:val="top"/>
+          </w:tcPr>
+          <w:p>
+            <w:pPr>
+              <w:spacing w:after="40"/>
+            </w:pPr>
+            <w:r>
+              <w:rPr>
+                <w:sz w:val="20"/>
+              </w:rPr>
+              <w:t>Status</w:t>
+            </w:r>
+          </w:p>
+        </w:tc>
+        <w:tc>
+          <w:tcPr>
+            <w:tcW w:type="dxa" w:w="7488"/>
+            <w:vAlign w:val="top"/>
+          </w:tcPr>
+          <w:p>
+            <w:pPr>
+              <w:spacing w:after="40"/>
+            </w:pPr>
+            <w:r>
+              <w:rPr>
+                <w:sz w:val="20"/>
+              </w:rPr>
+              <w:t>Accepted 2026-10-26</w:t>
+            </w:r>
+          </w:p>
+        </w:tc>
+      </w:tr>
+      <w:tr>
+        <w:tc>
+          <w:tcPr>
+            <w:tcW w:type="dxa" w:w="1872"/>
+            <w:vAlign w:val="top"/>
+          </w:tcPr>
+          <w:p>
+            <w:pPr>
+              <w:spacing w:after="40"/>
+            </w:pPr>
+            <w:r>
+              <w:rPr>
+                <w:sz w:val="20"/>
+              </w:rPr>
+              <w:t>Context</w:t>
+            </w:r>
+          </w:p>
+        </w:tc>
+        <w:tc>
+          <w:tcPr>
+            <w:tcW w:type="dxa" w:w="7488"/>
+            <w:vAlign w:val="top"/>
+          </w:tcPr>
+          <w:p>
+            <w:pPr>
+              <w:spacing w:after="40"/>
+            </w:pPr>
+            <w:r>
+              <w:rPr>
+                <w:sz w:val="20"/>
+              </w:rPr>
+              <w:t>The Word export maps each block as listed in the SRS Export reference (FR-63).</w:t>
+            </w:r>
+          </w:p>
+          <w:p>
+            <w:pPr>
+              <w:spacing w:after="40"/>
+            </w:pPr>
+            <w:r>
+              <w:rPr>
+                <w:sz w:val="20"/>
+              </w:rPr>
+              <w:t>Formulas become editable Word equations through mathml2omml (FR-57), or images when conversion is off or fails (FR-56).</w:t>
+            </w:r>
+          </w:p>
+          <w:p>
+            <w:pPr>
+              <w:spacing w:after="40"/>
+            </w:pPr>
+            <w:r>
+              <w:rPr>
+                <w:sz w:val="20"/>
+              </w:rPr>
+              <w:t>Each image carries its alt text into the .docx (FR-52).</w:t>
+            </w:r>
+          </w:p>
+          <w:p>
+            <w:pPr>
+              <w:spacing w:after="40"/>
+            </w:pPr>
+            <w:r>
+              <w:rPr>
+                <w:sz w:val="20"/>
+              </w:rPr>
+              <w:t>The Word exporter is one module behind the shared interface (ADR-006).</w:t>
+            </w:r>
+          </w:p>
+        </w:tc>
+      </w:tr>
+      <w:tr>
+        <w:tc>
+          <w:tcPr>
+            <w:tcW w:type="dxa" w:w="1872"/>
+            <w:vAlign w:val="top"/>
+          </w:tcPr>
+          <w:p>
+            <w:pPr>
+              <w:spacing w:after="40"/>
+            </w:pPr>
+            <w:r>
+              <w:rPr>
+                <w:sz w:val="20"/>
+              </w:rPr>
+              <w:t>Decision</w:t>
+            </w:r>
+          </w:p>
+        </w:tc>
+        <w:tc>
+          <w:tcPr>
+            <w:tcW w:type="dxa" w:w="7488"/>
+            <w:vAlign w:val="top"/>
+          </w:tcPr>
+          <w:p>
+            <w:pPr>
+              <w:spacing w:after="40"/>
+            </w:pPr>
+            <w:r>
+              <w:rPr>
+                <w:sz w:val="20"/>
+              </w:rPr>
+              <w:t xml:space="preserve">The Word exporter builds the .docx with the </w:t>
+            </w:r>
+            <w:r>
+              <w:rPr>
+                <w:rFonts w:ascii="Consolas" w:hAnsi="Consolas"/>
+                <w:sz w:val="20"/>
+              </w:rPr>
+              <w:t>docx</w:t>
+            </w:r>
+            <w:r>
+              <w:rPr>
+                <w:sz w:val="20"/>
+              </w:rPr>
+              <w:t xml:space="preserve"> package (MIT; 9.14.0 tested). It runs in main under Node.</w:t>
+            </w:r>
+          </w:p>
+          <w:p>
+            <w:pPr>
+              <w:spacing w:after="40"/>
+            </w:pPr>
+            <w:r>
+              <w:rPr>
+                <w:sz w:val="20"/>
+              </w:rPr>
+              <w:t xml:space="preserve">OMML from mathml2omml goes into a paragraph through </w:t>
+            </w:r>
+            <w:r>
+              <w:rPr>
+                <w:rFonts w:ascii="Consolas" w:hAnsi="Consolas"/>
+                <w:sz w:val="20"/>
+              </w:rPr>
+              <w:t>ImportedXmlComponent.fromXmlString()</w:t>
+            </w:r>
+            <w:r>
+              <w:rPr>
+                <w:sz w:val="20"/>
+              </w:rPr>
+              <w:t>.</w:t>
+            </w:r>
+          </w:p>
+        </w:tc>
+      </w:tr>
+      <w:tr>
+        <w:tc>
+          <w:tcPr>
+            <w:tcW w:type="dxa" w:w="1872"/>
+            <w:vAlign w:val="top"/>
+          </w:tcPr>
+          <w:p>
+            <w:pPr>
+              <w:spacing w:after="40"/>
+            </w:pPr>
+            <w:r>
+              <w:rPr>
+                <w:sz w:val="20"/>
+              </w:rPr>
+              <w:t>Alternatives</w:t>
+            </w:r>
+          </w:p>
+        </w:tc>
+        <w:tc>
+          <w:tcPr>
+            <w:tcW w:type="dxa" w:w="7488"/>
+            <w:vAlign w:val="top"/>
+          </w:tcPr>
+          <w:p>
+            <w:pPr>
+              <w:spacing w:after="40"/>
+            </w:pPr>
+            <w:r>
+              <w:rPr>
+                <w:sz w:val="20"/>
+              </w:rPr>
+              <w:t>docxtemplater: fills placeholders in an existing template instead of building a document, and images need a paid module.</w:t>
+            </w:r>
+          </w:p>
+          <w:p>
+            <w:pPr>
+              <w:spacing w:after="40"/>
+            </w:pPr>
+            <w:r>
+              <w:rPr>
+                <w:sz w:val="20"/>
+              </w:rPr>
+              <w:t>Write the OOXML ourselves: full control, but weeks of work (content types, relationships, numbering, styles, image sizing, headers and footers, escaping). Possible later behind the ADR-006 interface if docx falls short.</w:t>
+            </w:r>
+          </w:p>
+          <w:p>
+            <w:pPr>
+              <w:spacing w:after="40"/>
+            </w:pPr>
+            <w:r>
+              <w:rPr>
+                <w:sz w:val="20"/>
+              </w:rPr>
+              <w:t>html-to-docx: stale (last release March 2023) and has no OMML path.</w:t>
+            </w:r>
+          </w:p>
+        </w:tc>
+      </w:tr>
+      <w:tr>
+        <w:tc>
+          <w:tcPr>
+            <w:tcW w:type="dxa" w:w="1872"/>
+            <w:vAlign w:val="top"/>
+          </w:tcPr>
+          <w:p>
+            <w:pPr>
+              <w:spacing w:after="40"/>
+            </w:pPr>
+            <w:r>
+              <w:rPr>
+                <w:sz w:val="20"/>
+              </w:rPr>
+              <w:t>Consequences</w:t>
+            </w:r>
+          </w:p>
+        </w:tc>
+        <w:tc>
+          <w:tcPr>
+            <w:tcW w:type="dxa" w:w="7488"/>
+            <w:vAlign w:val="top"/>
+          </w:tcPr>
+          <w:p>
+            <w:pPr>
+              <w:spacing w:after="40"/>
+            </w:pPr>
+            <w:r>
+              <w:rPr>
+                <w:sz w:val="20"/>
+              </w:rPr>
+              <w:t>Letter is not the default, so the exporter sets Letter page size and margins itself.</w:t>
+            </w:r>
+          </w:p>
+          <w:p>
+            <w:pPr>
+              <w:spacing w:after="40"/>
+            </w:pPr>
+            <w:r>
+              <w:rPr>
+                <w:sz w:val="20"/>
+              </w:rPr>
+              <w:t>The package is about 21 MB unpacked because it ships several builds; only one is loaded.</w:t>
+            </w:r>
+          </w:p>
+          <w:p>
+            <w:pPr>
+              <w:spacing w:after="40"/>
+            </w:pPr>
+            <w:r>
+              <w:rPr>
+                <w:sz w:val="20"/>
+              </w:rPr>
+              <w:t>It depends on JSZip, which is MIT or GPLv3; Obelisk uses it under MIT. Both notices go on the About page (NFR-28).</w:t>
+            </w:r>
+          </w:p>
+          <w:p>
+            <w:pPr>
+              <w:spacing w:after="40"/>
+            </w:pPr>
+            <w:r>
+              <w:rPr>
+                <w:sz w:val="20"/>
+              </w:rPr>
+              <w:t>mathml2omml stays a separate LGPL module (NFR-29); docx does not change that.</w:t>
+            </w:r>
+          </w:p>
+          <w:p>
+            <w:pPr>
+              <w:spacing w:after="40"/>
+            </w:pPr>
+            <w:r>
+              <w:rPr>
+                <w:sz w:val="20"/>
+              </w:rPr>
+              <w:t>Word fidelity is checked by hand in Word (spike S-09).</w:t>
+            </w:r>
+          </w:p>
+        </w:tc>
+      </w:tr>
+      <w:tr>
+        <w:tc>
+          <w:tcPr>
+            <w:tcW w:type="dxa" w:w="1872"/>
+            <w:vAlign w:val="top"/>
+          </w:tcPr>
+          <w:p>
+            <w:pPr>
+              <w:spacing w:after="40"/>
+            </w:pPr>
+            <w:r>
+              <w:rPr>
+                <w:sz w:val="20"/>
+              </w:rPr>
+              <w:t>Revisit when</w:t>
+            </w:r>
+          </w:p>
+        </w:tc>
+        <w:tc>
+          <w:tcPr>
+            <w:tcW w:type="dxa" w:w="7488"/>
+            <w:vAlign w:val="top"/>
+          </w:tcPr>
+          <w:p>
+            <w:pPr>
+              <w:spacing w:after="40"/>
+            </w:pPr>
+            <w:r>
+              <w:rPr>
+                <w:sz w:val="20"/>
+              </w:rPr>
+              <w:t>docx fails spike S-09, stops being maintained, or cannot write a block the Export reference needs.</w:t>
+            </w:r>
+          </w:p>
+        </w:tc>
+      </w:tr>
+    </w:tbl>
+    <w:p>
+      <w:pPr>
+        <w:spacing w:after="40"/>
+      </w:pPr>
+    </w:p>
+    <w:p>
+      <w:pPr>
+        <w:pStyle w:val="Heading2"/>
+      </w:pPr>
+      <w:r>
+        <w:t>ADR-013 .obk files are read with yauzl and written with yazl</w:t>
+      </w:r>
+    </w:p>
+    <w:tbl>
+      <w:tblPr>
+        <w:tblStyle w:val="TableGrid"/>
+        <w:tblW w:type="auto" w:w="0"/>
+        <w:tblLayout w:type="fixed"/>
+        <w:tblLook w:firstColumn="1" w:firstRow="1" w:lastColumn="0" w:lastRow="0" w:noHBand="0" w:noVBand="1" w:val="04A0"/>
+      </w:tblPr>
+      <w:tblGrid>
+        <w:gridCol w:w="1872"/>
+        <w:gridCol w:w="7488"/>
+      </w:tblGrid>
+      <w:tr>
+        <w:trPr>
+          <w:tblHeader w:val="true"/>
+        </w:trPr>
+        <w:tc>
+          <w:tcPr>
+            <w:tcW w:type="dxa" w:w="1872"/>
+            <w:shd w:val="clear" w:color="auto" w:fill="D9E2F3"/>
+          </w:tcPr>
+          <w:p>
+            <w:r/>
+            <w:r>
+              <w:rPr>
+                <w:b/>
+                <w:sz w:val="20"/>
+              </w:rPr>
+              <w:t>Field</w:t>
+            </w:r>
+          </w:p>
+        </w:tc>
+        <w:tc>
+          <w:tcPr>
+            <w:tcW w:type="dxa" w:w="7488"/>
+            <w:shd w:val="clear" w:color="auto" w:fill="D9E2F3"/>
+          </w:tcPr>
+          <w:p>
+            <w:r/>
+            <w:r>
+              <w:rPr>
+                <w:b/>
+                <w:sz w:val="20"/>
+              </w:rPr>
+              <w:t>Content</w:t>
+            </w:r>
+          </w:p>
+        </w:tc>
+      </w:tr>
+      <w:tr>
+        <w:tc>
+          <w:tcPr>
+            <w:tcW w:type="dxa" w:w="1872"/>
+            <w:vAlign w:val="top"/>
+          </w:tcPr>
+          <w:p>
+            <w:pPr>
+              <w:spacing w:after="40"/>
+            </w:pPr>
+            <w:r>
+              <w:rPr>
+                <w:sz w:val="20"/>
+              </w:rPr>
+              <w:t>Status</w:t>
+            </w:r>
+          </w:p>
+        </w:tc>
+        <w:tc>
+          <w:tcPr>
+            <w:tcW w:type="dxa" w:w="7488"/>
+            <w:vAlign w:val="top"/>
+          </w:tcPr>
+          <w:p>
+            <w:pPr>
+              <w:spacing w:after="40"/>
+            </w:pPr>
+            <w:r>
+              <w:rPr>
+                <w:sz w:val="20"/>
+              </w:rPr>
+              <w:t>Accepted 2026-10-26</w:t>
+            </w:r>
+          </w:p>
+        </w:tc>
+      </w:tr>
+      <w:tr>
+        <w:tc>
+          <w:tcPr>
+            <w:tcW w:type="dxa" w:w="1872"/>
+            <w:vAlign w:val="top"/>
+          </w:tcPr>
+          <w:p>
+            <w:pPr>
+              <w:spacing w:after="40"/>
+            </w:pPr>
+            <w:r>
+              <w:rPr>
+                <w:sz w:val="20"/>
+              </w:rPr>
+              <w:t>Context</w:t>
+            </w:r>
+          </w:p>
+        </w:tc>
+        <w:tc>
+          <w:tcPr>
+            <w:tcW w:type="dxa" w:w="7488"/>
+            <w:vAlign w:val="top"/>
+          </w:tcPr>
+          <w:p>
+            <w:pPr>
+              <w:spacing w:after="40"/>
+            </w:pPr>
+            <w:r>
+              <w:rPr>
+                <w:sz w:val="20"/>
+              </w:rPr>
+              <w:t>An .obk file is one ZIP container (ADR-003).</w:t>
+            </w:r>
+          </w:p>
+          <w:p>
+            <w:pPr>
+              <w:spacing w:after="40"/>
+            </w:pPr>
+            <w:r>
+              <w:rPr>
+                <w:sz w:val="20"/>
+              </w:rPr>
+              <w:t>Section 6.6: caps count the bytes actually read, entries are read in memory only, and entry names are strict.</w:t>
+            </w:r>
+          </w:p>
+          <w:p>
+            <w:pPr>
+              <w:spacing w:after="40"/>
+            </w:pPr>
+            <w:r>
+              <w:rPr>
+                <w:sz w:val="20"/>
+              </w:rPr>
+              <w:t>A file that fails a check opens nothing and stays unchanged (FR-09).</w:t>
+            </w:r>
+          </w:p>
+          <w:p>
+            <w:pPr>
+              <w:spacing w:after="40"/>
+            </w:pPr>
+            <w:r>
+              <w:rPr>
+                <w:sz w:val="20"/>
+              </w:rPr>
+              <w:t>Decoding may move to a sandboxed utilityProcess (R-08, spike S-08).</w:t>
+            </w:r>
+          </w:p>
+        </w:tc>
+      </w:tr>
+      <w:tr>
+        <w:tc>
+          <w:tcPr>
+            <w:tcW w:type="dxa" w:w="1872"/>
+            <w:vAlign w:val="top"/>
+          </w:tcPr>
+          <w:p>
+            <w:pPr>
+              <w:spacing w:after="40"/>
+            </w:pPr>
+            <w:r>
+              <w:rPr>
+                <w:sz w:val="20"/>
+              </w:rPr>
+              <w:t>Decision</w:t>
+            </w:r>
+          </w:p>
+        </w:tc>
+        <w:tc>
+          <w:tcPr>
+            <w:tcW w:type="dxa" w:w="7488"/>
+            <w:vAlign w:val="top"/>
+          </w:tcPr>
+          <w:p>
+            <w:pPr>
+              <w:spacing w:after="40"/>
+            </w:pPr>
+            <w:r>
+              <w:rPr>
+                <w:sz w:val="20"/>
+              </w:rPr>
+              <w:t xml:space="preserve">FormatCodec reads .obk files with </w:t>
+            </w:r>
+            <w:r>
+              <w:rPr>
+                <w:rFonts w:ascii="Consolas" w:hAnsi="Consolas"/>
+                <w:sz w:val="20"/>
+              </w:rPr>
+              <w:t>yauzl</w:t>
+            </w:r>
+            <w:r>
+              <w:rPr>
+                <w:sz w:val="20"/>
+              </w:rPr>
+              <w:t xml:space="preserve"> (3.4.0, MIT) and writes them with </w:t>
+            </w:r>
+            <w:r>
+              <w:rPr>
+                <w:rFonts w:ascii="Consolas" w:hAnsi="Consolas"/>
+                <w:sz w:val="20"/>
+              </w:rPr>
+              <w:t>yazl</w:t>
+            </w:r>
+            <w:r>
+              <w:rPr>
+                <w:sz w:val="20"/>
+              </w:rPr>
+              <w:t xml:space="preserve"> (3.3.1, MIT). Types come from DefinitelyTyped.</w:t>
+            </w:r>
+          </w:p>
+          <w:p>
+            <w:pPr>
+              <w:spacing w:after="40"/>
+            </w:pPr>
+            <w:r>
+              <w:rPr>
+                <w:sz w:val="20"/>
+              </w:rPr>
+              <w:t>yauzl reads the central directory first, so names and declared sizes are known before anything is inflated.</w:t>
+            </w:r>
+          </w:p>
+          <w:p>
+            <w:pPr>
+              <w:spacing w:after="40"/>
+            </w:pPr>
+            <w:r>
+              <w:rPr>
+                <w:sz w:val="20"/>
+              </w:rPr>
+              <w:t>It errors when the real bytes pass the declared size, refuses ../ and absolute paths by default, and never writes to disk.</w:t>
+            </w:r>
+          </w:p>
+          <w:p>
+            <w:pPr>
+              <w:spacing w:after="40"/>
+            </w:pPr>
+            <w:r>
+              <w:rPr>
+                <w:sz w:val="20"/>
+              </w:rPr>
+              <w:t>yazl writes with a fixed modified time, so the same document gives the same bytes.</w:t>
+            </w:r>
+          </w:p>
+        </w:tc>
+      </w:tr>
+      <w:tr>
+        <w:tc>
+          <w:tcPr>
+            <w:tcW w:type="dxa" w:w="1872"/>
+            <w:vAlign w:val="top"/>
+          </w:tcPr>
+          <w:p>
+            <w:pPr>
+              <w:spacing w:after="40"/>
+            </w:pPr>
+            <w:r>
+              <w:rPr>
+                <w:sz w:val="20"/>
+              </w:rPr>
+              <w:t>Alternatives</w:t>
+            </w:r>
+          </w:p>
+        </w:tc>
+        <w:tc>
+          <w:tcPr>
+            <w:tcW w:type="dxa" w:w="7488"/>
+            <w:vAlign w:val="top"/>
+          </w:tcPr>
+          <w:p>
+            <w:pPr>
+              <w:spacing w:after="40"/>
+            </w:pPr>
+            <w:r>
+              <w:rPr>
+                <w:sz w:val="20"/>
+              </w:rPr>
+              <w:t>@zip.js/zip.js (BSD-3-Clause): a close second. No dependencies, bundled types, and clean caps, but larger and built on Web Streams.</w:t>
+            </w:r>
+          </w:p>
+          <w:p>
+            <w:pPr>
+              <w:spacing w:after="40"/>
+            </w:pPr>
+            <w:r>
+              <w:rPr>
+                <w:sz w:val="20"/>
+              </w:rPr>
+              <w:t>fflate: in a test it read about 67 MB past a 25 MB cap, and it does no name checks.</w:t>
+            </w:r>
+          </w:p>
+          <w:p>
+            <w:pPr>
+              <w:spacing w:after="40"/>
+            </w:pPr>
+            <w:r>
+              <w:rPr>
+                <w:sz w:val="20"/>
+              </w:rPr>
+              <w:t>JSZip: silently renamed a ../evil.txt entry to evil.txt.</w:t>
+            </w:r>
+          </w:p>
+          <w:p>
+            <w:pPr>
+              <w:spacing w:after="40"/>
+            </w:pPr>
+            <w:r>
+              <w:rPr>
+                <w:sz w:val="20"/>
+              </w:rPr>
+              <w:t>adm-zip: inflated a whole 300 MB bomb into memory, with no cap.</w:t>
+            </w:r>
+          </w:p>
+        </w:tc>
+      </w:tr>
+      <w:tr>
+        <w:tc>
+          <w:tcPr>
+            <w:tcW w:type="dxa" w:w="1872"/>
+            <w:vAlign w:val="top"/>
+          </w:tcPr>
+          <w:p>
+            <w:pPr>
+              <w:spacing w:after="40"/>
+            </w:pPr>
+            <w:r>
+              <w:rPr>
+                <w:sz w:val="20"/>
+              </w:rPr>
+              <w:t>Consequences</w:t>
+            </w:r>
+          </w:p>
+        </w:tc>
+        <w:tc>
+          <w:tcPr>
+            <w:tcW w:type="dxa" w:w="7488"/>
+            <w:vAlign w:val="top"/>
+          </w:tcPr>
+          <w:p>
+            <w:pPr>
+              <w:spacing w:after="40"/>
+            </w:pPr>
+            <w:r>
+              <w:rPr>
+                <w:sz w:val="20"/>
+              </w:rPr>
+              <w:t>Our own checks are still needed for the name allowlist, case duplicates, encrypted entries, and headers that disagree (H-03, H-06, H-07).</w:t>
+            </w:r>
+          </w:p>
+          <w:p>
+            <w:pPr>
+              <w:spacing w:after="40"/>
+            </w:pPr>
+            <w:r>
+              <w:rPr>
+                <w:sz w:val="20"/>
+              </w:rPr>
+              <w:t>yauzl's callback API is wrapped in a small promise helper inside FormatCodec.</w:t>
+            </w:r>
+          </w:p>
+          <w:p>
+            <w:pPr>
+              <w:spacing w:after="40"/>
+            </w:pPr>
+            <w:r>
+              <w:rPr>
+                <w:sz w:val="20"/>
+              </w:rPr>
+              <w:t>yazl's last release was November 2024. It is small and stable, but worth watching.</w:t>
+            </w:r>
+          </w:p>
+        </w:tc>
+      </w:tr>
+      <w:tr>
+        <w:tc>
+          <w:tcPr>
+            <w:tcW w:type="dxa" w:w="1872"/>
+            <w:vAlign w:val="top"/>
+          </w:tcPr>
+          <w:p>
+            <w:pPr>
+              <w:spacing w:after="40"/>
+            </w:pPr>
+            <w:r>
+              <w:rPr>
+                <w:sz w:val="20"/>
+              </w:rPr>
+              <w:t>Revisit when</w:t>
+            </w:r>
+          </w:p>
+        </w:tc>
+        <w:tc>
+          <w:tcPr>
+            <w:tcW w:type="dxa" w:w="7488"/>
+            <w:vAlign w:val="top"/>
+          </w:tcPr>
+          <w:p>
+            <w:pPr>
+              <w:spacing w:after="40"/>
+            </w:pPr>
+            <w:r>
+              <w:rPr>
+                <w:sz w:val="20"/>
+              </w:rPr>
+              <w:t>Either package is abandoned or has an unfixed security issue, spike S-08 fails, or format version 2 needs features they lack.</w:t>
             </w:r>
           </w:p>
         </w:tc>
@@ -17708,7 +18715,7 @@
               <w:rPr>
                 <w:sz w:val="18"/>
               </w:rPr>
-              <w:t>A .docx writer library (proposal)</w:t>
+              <w:t>docx</w:t>
             </w:r>
           </w:p>
         </w:tc>
@@ -17725,7 +18732,7 @@
               <w:rPr>
                 <w:sz w:val="18"/>
               </w:rPr>
-              <w:t>UNVERIFIED</w:t>
+              <w:t>9.14.0 (tested); pin at implementation</w:t>
             </w:r>
           </w:p>
         </w:tc>
@@ -17742,7 +18749,7 @@
               <w:rPr>
                 <w:sz w:val="18"/>
               </w:rPr>
-              <w:t>Builds .docx under Node</w:t>
+              <w:t>Builds .docx under Node, including OMML and alt text (ADR-012)</w:t>
             </w:r>
           </w:p>
         </w:tc>
@@ -17759,7 +18766,7 @@
               <w:rPr>
                 <w:sz w:val="18"/>
               </w:rPr>
-              <w:t>UNVERIFIED</w:t>
+              <w:t>MIT</w:t>
             </w:r>
           </w:p>
         </w:tc>
@@ -17969,7 +18976,7 @@
               <w:rPr>
                 <w:sz w:val="18"/>
               </w:rPr>
-              <w:t>A ZIP library for Node (proposal)</w:t>
+              <w:t>yauzl (read) + yazl (write)</w:t>
             </w:r>
           </w:p>
         </w:tc>
@@ -17986,7 +18993,7 @@
               <w:rPr>
                 <w:sz w:val="18"/>
               </w:rPr>
-              <w:t>UNVERIFIED</w:t>
+              <w:t>3.4.0 + 3.3.1</w:t>
             </w:r>
           </w:p>
         </w:tc>
@@ -18003,7 +19010,7 @@
               <w:rPr>
                 <w:sz w:val="18"/>
               </w:rPr>
-              <w:t>Reads and writes .obk</w:t>
+              <w:t>Reads and writes .obk with real-byte caps (ADR-013)</w:t>
             </w:r>
           </w:p>
         </w:tc>
@@ -18020,7 +19027,7 @@
               <w:rPr>
                 <w:sz w:val="18"/>
               </w:rPr>
-              <w:t>UNVERIFIED</w:t>
+              <w:t>MIT</w:t>
             </w:r>
           </w:p>
         </w:tc>
@@ -18214,7 +19221,7 @@
         <w:t xml:space="preserve">UNVERIFIED: </w:t>
       </w:r>
       <w:r>
-        <w:t>Versions and the licenses marked UNVERIFIED. Fix them after the spikes below, from each project's package page.</w:t>
+        <w:t>Versions and licenses still marked UNVERIFIED. The Word math, Word file, and ZIP rows were checked on npm. Fix the rest after the spikes below, from each project's package page.</w:t>
       </w:r>
     </w:p>
     <w:p>
@@ -18692,7 +19699,51 @@
               <w:rPr>
                 <w:sz w:val="19"/>
               </w:rPr>
-              <w:t>Decode .obk files in a sandboxed Electron utilityProcess instead of main.</w:t>
+              <w:t>Decode .obk files in a sandboxed Electron utilityProcess instead of main. Run FormatCodec on yauzl and yazl under Node and inside an Electron 45 utilityProcess:</w:t>
+            </w:r>
+          </w:p>
+          <w:p>
+            <w:pPr>
+              <w:spacing w:after="40"/>
+            </w:pPr>
+            <w:r>
+              <w:rPr>
+                <w:sz w:val="19"/>
+              </w:rPr>
+              <w:t>Hostile samples H-01 to H-09 are refused, including a bomb with a forged small size, stopped at the 25 MB, 20 MB, and 250 MB real-byte caps.</w:t>
+            </w:r>
+          </w:p>
+          <w:p>
+            <w:pPr>
+              <w:spacing w:after="40"/>
+            </w:pPr>
+            <w:r>
+              <w:rPr>
+                <w:sz w:val="19"/>
+              </w:rPr>
+              <w:t>Bad names are refused: ../, a leading slash, a backslash, drive letters, network paths, stream suffixes, CON, and case duplicates.</w:t>
+            </w:r>
+          </w:p>
+          <w:p>
+            <w:pPr>
+              <w:spacing w:after="40"/>
+            </w:pPr>
+            <w:r>
+              <w:rPr>
+                <w:sz w:val="19"/>
+              </w:rPr>
+              <w:t>Saving a 200-image document twice gives byte-identical files.</w:t>
+            </w:r>
+          </w:p>
+          <w:p>
+            <w:pPr>
+              <w:spacing w:after="40"/>
+            </w:pPr>
+            <w:r>
+              <w:rPr>
+                <w:sz w:val="19"/>
+              </w:rPr>
+              <w:t>Each refused file stays unchanged (FR-09).</w:t>
             </w:r>
           </w:p>
         </w:tc>
@@ -18709,7 +19760,154 @@
               <w:rPr>
                 <w:sz w:val="19"/>
               </w:rPr>
-              <w:t>R-08</w:t>
+              <w:t>R-08, ADR-013, FR-09</w:t>
+            </w:r>
+          </w:p>
+        </w:tc>
+      </w:tr>
+      <w:tr>
+        <w:tc>
+          <w:tcPr>
+            <w:tcW w:type="dxa" w:w="864"/>
+            <w:vAlign w:val="top"/>
+          </w:tcPr>
+          <w:p>
+            <w:pPr>
+              <w:spacing w:after="40"/>
+            </w:pPr>
+            <w:r>
+              <w:rPr>
+                <w:sz w:val="19"/>
+              </w:rPr>
+              <w:t>S-09</w:t>
+            </w:r>
+          </w:p>
+        </w:tc>
+        <w:tc>
+          <w:tcPr>
+            <w:tcW w:type="dxa" w:w="6336"/>
+            <w:vAlign w:val="top"/>
+          </w:tcPr>
+          <w:p>
+            <w:pPr>
+              <w:spacing w:after="40"/>
+            </w:pPr>
+            <w:r>
+              <w:rPr>
+                <w:sz w:val="19"/>
+              </w:rPr>
+              <w:t>Export with docx and open the results in current Word for Windows:</w:t>
+            </w:r>
+          </w:p>
+          <w:p>
+            <w:pPr>
+              <w:spacing w:after="40"/>
+            </w:pPr>
+            <w:r>
+              <w:rPr>
+                <w:sz w:val="19"/>
+              </w:rPr>
+              <w:t>The formula samples stay editable with conversion on (AC-11), and appear as images with conversion off.</w:t>
+            </w:r>
+          </w:p>
+          <w:p>
+            <w:pPr>
+              <w:spacing w:after="40"/>
+            </w:pPr>
+            <w:r>
+              <w:rPr>
+                <w:sz w:val="19"/>
+              </w:rPr>
+              <w:t>Each Export reference row opens cleanly in Word.</w:t>
+            </w:r>
+          </w:p>
+          <w:p>
+            <w:pPr>
+              <w:spacing w:after="40"/>
+            </w:pPr>
+            <w:r>
+              <w:rPr>
+                <w:sz w:val="19"/>
+              </w:rPr>
+              <w:t>Image alt text shows in Word's Alt Text pane.</w:t>
+            </w:r>
+          </w:p>
+          <w:p>
+            <w:pPr>
+              <w:spacing w:after="40"/>
+            </w:pPr>
+            <w:r>
+              <w:rPr>
+                <w:sz w:val="19"/>
+              </w:rPr>
+              <w:t>Hostile text (</w:t>
+            </w:r>
+            <w:r>
+              <w:rPr>
+                <w:rFonts w:ascii="Consolas" w:hAnsi="Consolas"/>
+                <w:sz w:val="19"/>
+              </w:rPr>
+              <w:t>&lt;</w:t>
+            </w:r>
+            <w:r>
+              <w:rPr>
+                <w:sz w:val="19"/>
+              </w:rPr>
+              <w:t xml:space="preserve">, </w:t>
+            </w:r>
+            <w:r>
+              <w:rPr>
+                <w:rFonts w:ascii="Consolas" w:hAnsi="Consolas"/>
+                <w:sz w:val="19"/>
+              </w:rPr>
+              <w:t>&amp;</w:t>
+            </w:r>
+            <w:r>
+              <w:rPr>
+                <w:sz w:val="19"/>
+              </w:rPr>
+              <w:t xml:space="preserve">, </w:t>
+            </w:r>
+            <w:r>
+              <w:rPr>
+                <w:rFonts w:ascii="Consolas" w:hAnsi="Consolas"/>
+                <w:sz w:val="19"/>
+              </w:rPr>
+              <w:t>]]&gt;</w:t>
+            </w:r>
+            <w:r>
+              <w:rPr>
+                <w:sz w:val="19"/>
+              </w:rPr>
+              <w:t>, control characters, unpaired surrogates) stays text, not markup (H-26).</w:t>
+            </w:r>
+          </w:p>
+          <w:p>
+            <w:pPr>
+              <w:spacing w:after="40"/>
+            </w:pPr>
+            <w:r>
+              <w:rPr>
+                <w:sz w:val="19"/>
+              </w:rPr>
+              <w:t>A large export finishes in under 10 seconds with no network calls (NFR-04).</w:t>
+            </w:r>
+          </w:p>
+        </w:tc>
+        <w:tc>
+          <w:tcPr>
+            <w:tcW w:type="dxa" w:w="2160"/>
+            <w:vAlign w:val="top"/>
+          </w:tcPr>
+          <w:p>
+            <w:pPr>
+              <w:spacing w:after="40"/>
+            </w:pPr>
+            <w:r>
+              <w:rPr>
+                <w:sz w:val="19"/>
+              </w:rPr>
+              <w:t>ADR-012, FR-52, FR-56, FR-57, FR-63</w:t>
             </w:r>
           </w:p>
         </w:tc>
@@ -19594,7 +20792,7 @@
               <w:rPr>
                 <w:sz w:val="18"/>
               </w:rPr>
-              <w:t>ADR-011</w:t>
+              <w:t>ADR-011, ADR-013</w:t>
             </w:r>
           </w:p>
         </w:tc>
@@ -23335,7 +24533,7 @@
               <w:rPr>
                 <w:sz w:val="18"/>
               </w:rPr>
-              <w:t>-</w:t>
+              <w:t>ADR-012</w:t>
             </w:r>
           </w:p>
         </w:tc>
@@ -23683,7 +24881,7 @@
               <w:rPr>
                 <w:sz w:val="18"/>
               </w:rPr>
-              <w:t>ADR-005</w:t>
+              <w:t>ADR-005, ADR-012</w:t>
             </w:r>
           </w:p>
         </w:tc>
@@ -23770,7 +24968,7 @@
               <w:rPr>
                 <w:sz w:val="18"/>
               </w:rPr>
-              <w:t>ADR-005</w:t>
+              <w:t>ADR-005, ADR-012</w:t>
             </w:r>
           </w:p>
         </w:tc>
@@ -24292,7 +25490,7 @@
               <w:rPr>
                 <w:sz w:val="18"/>
               </w:rPr>
-              <w:t>-</w:t>
+              <w:t>ADR-012</w:t>
             </w:r>
           </w:p>
         </w:tc>
@@ -28468,7 +29666,7 @@
               <w:rPr>
                 <w:sz w:val="18"/>
               </w:rPr>
-              <w:t>-</w:t>
+              <w:t>ADR-012</w:t>
             </w:r>
           </w:p>
         </w:tc>
@@ -28555,7 +29753,7 @@
               <w:rPr>
                 <w:sz w:val="18"/>
               </w:rPr>
-              <w:t>ADR-005</w:t>
+              <w:t>ADR-005, ADR-012</w:t>
             </w:r>
           </w:p>
         </w:tc>
@@ -30687,7 +31885,7 @@
               <w:rPr>
                 <w:sz w:val="19"/>
               </w:rPr>
-              <w:t>1.1, October 23, 2026</w:t>
+              <w:t>1.2, October 26, 2026</w:t>
             </w:r>
           </w:p>
         </w:tc>
@@ -30723,7 +31921,7 @@
               <w:rPr>
                 <w:sz w:val="19"/>
               </w:rPr>
-              <w:t>SRS version 1.1</w:t>
+              <w:t>SRS version 1.2</w:t>
             </w:r>
           </w:p>
         </w:tc>
@@ -30856,7 +32054,7 @@
         <w:spacing w:after="60"/>
       </w:pPr>
       <w:r>
-        <w:t>Obelisk SRS (Plong_Obelisk_SRS.docx), version 1.1.</w:t>
+        <w:t>Obelisk SRS (Plong_Obelisk_SRS.docx), version 1.2.</w:t>
       </w:r>
     </w:p>
     <w:p>
@@ -30911,6 +32109,15 @@
       </w:pPr>
       <w:r>
         <w:t>mathml2omml: npmjs.com/package/mathml2omml.</w:t>
+      </w:r>
+    </w:p>
+    <w:p>
+      <w:pPr>
+        <w:pStyle w:val="ListBullet"/>
+        <w:spacing w:after="60"/>
+      </w:pPr>
+      <w:r>
+        <w:t>docx: npmjs.com/package/docx. yauzl and yazl: npmjs.com/package/yauzl and npmjs.com/package/yazl.</w:t>
       </w:r>
     </w:p>
     <w:p>

</xml_diff>

<commit_message>
Update the SRS and Architecture to 1.3 with the spike results.
Fold spikes S-01 to S-09 into both documents, close the UNVERIFIED lines those spikes settled, and record the owner decisions on FormatCodec decoding, elkjs, and diagram click links. Apply the approved menu wording (MW-01 to MW-11) and name the link opener that owns link:open. Bump both docs to version 1.3 (October 27, 2026), refresh the Markdown, Word, and PDF copies, point the README documentation links at 1.3, and move the approved 1.3 drafts under docs/drafts/archive/. Docs only. No version bump.

Co-authored-by: Cursor Agent <cursoragent@cursor.com>
</commit_message>
<xml_diff>
--- a/docs/Plong_Obelisk_Architecture.docx
+++ b/docs/Plong_Obelisk_Architecture.docx
@@ -62,7 +62,7 @@
         <w:t xml:space="preserve">Date: </w:t>
       </w:r>
       <w:r>
-        <w:t>October 26, 2026</w:t>
+        <w:t>October 27, 2026</w:t>
       </w:r>
     </w:p>
     <w:p>
@@ -76,7 +76,7 @@
         <w:t xml:space="preserve">Version: </w:t>
       </w:r>
       <w:r>
-        <w:t>1.2</w:t>
+        <w:t>1.3</w:t>
       </w:r>
     </w:p>
     <w:p/>
@@ -205,7 +205,7 @@
       </w:r>
       <w:r>
         <w:tab/>
-        <w:t>13</w:t>
+        <w:t>14</w:t>
       </w:r>
     </w:p>
     <w:p>
@@ -220,7 +220,7 @@
       </w:r>
       <w:r>
         <w:tab/>
-        <w:t>22</w:t>
+        <w:t>25</w:t>
       </w:r>
     </w:p>
     <w:p>
@@ -235,7 +235,7 @@
       </w:r>
       <w:r>
         <w:tab/>
-        <w:t>27</w:t>
+        <w:t>31</w:t>
       </w:r>
     </w:p>
     <w:p>
@@ -250,7 +250,7 @@
       </w:r>
       <w:r>
         <w:tab/>
-        <w:t>28</w:t>
+        <w:t>32</w:t>
       </w:r>
     </w:p>
     <w:p>
@@ -265,7 +265,7 @@
       </w:r>
       <w:r>
         <w:tab/>
-        <w:t>30</w:t>
+        <w:t>35</w:t>
       </w:r>
     </w:p>
     <w:p>
@@ -280,7 +280,7 @@
       </w:r>
       <w:r>
         <w:tab/>
-        <w:t>33</w:t>
+        <w:t>38</w:t>
       </w:r>
     </w:p>
     <w:p>
@@ -295,7 +295,7 @@
       </w:r>
       <w:r>
         <w:tab/>
-        <w:t>34</w:t>
+        <w:t>39</w:t>
       </w:r>
     </w:p>
     <w:p>
@@ -530,6 +530,59 @@
           </w:p>
         </w:tc>
       </w:tr>
+      <w:tr>
+        <w:tc>
+          <w:tcPr>
+            <w:tcW w:type="dxa" w:w="1440"/>
+            <w:vAlign w:val="top"/>
+          </w:tcPr>
+          <w:p>
+            <w:pPr>
+              <w:spacing w:after="40"/>
+            </w:pPr>
+            <w:r>
+              <w:rPr>
+                <w:sz w:val="19"/>
+              </w:rPr>
+              <w:t>1.3</w:t>
+            </w:r>
+          </w:p>
+        </w:tc>
+        <w:tc>
+          <w:tcPr>
+            <w:tcW w:type="dxa" w:w="2304"/>
+            <w:vAlign w:val="top"/>
+          </w:tcPr>
+          <w:p>
+            <w:pPr>
+              <w:spacing w:after="40"/>
+            </w:pPr>
+            <w:r>
+              <w:rPr>
+                <w:sz w:val="19"/>
+              </w:rPr>
+              <w:t>October 27, 2026</w:t>
+            </w:r>
+          </w:p>
+        </w:tc>
+        <w:tc>
+          <w:tcPr>
+            <w:tcW w:type="dxa" w:w="5616"/>
+            <w:vAlign w:val="top"/>
+          </w:tcPr>
+          <w:p>
+            <w:pPr>
+              <w:spacing w:after="40"/>
+            </w:pPr>
+            <w:r>
+              <w:rPr>
+                <w:sz w:val="19"/>
+              </w:rPr>
+              <w:t>Recorded spikes S-01 to S-09. Closed the UNVERIFIED lines those spikes settled. Applied the approved menu wording and added the link opener component. Based on SRS 1.3.</w:t>
+            </w:r>
+          </w:p>
+        </w:tc>
+      </w:tr>
     </w:tbl>
     <w:p>
       <w:pPr>
@@ -547,12 +600,12 @@
     </w:p>
     <w:p>
       <w:r>
-        <w:t>This document shows how Obelisk will meet its SRS. It cites requirement IDs from the SRS (Plong_Obelisk_SRS.docx, version 1.2) instead of repeating them.</w:t>
+        <w:t>This document shows how Obelisk will meet its SRS. It cites requirement IDs from the SRS (Plong_Obelisk_SRS.docx, version 1.3) instead of repeating them.</w:t>
       </w:r>
     </w:p>
     <w:p>
       <w:r>
-        <w:t>Everything here is a proposal until accepted. Technology versions marked UNVERIFIED stay so until the spikes in section 9 confirm them.</w:t>
+        <w:t>Everything here is a proposal until accepted. Technology versions still marked UNVERIFIED in section 9 stay so until a later check. Spikes S-01 to S-09 confirmed the rows named there.</w:t>
       </w:r>
     </w:p>
     <w:p>
@@ -757,7 +810,7 @@
         <w:spacing w:after="60"/>
       </w:pPr>
       <w:r>
-        <w:t>KaTeX for formulas; mathml2omml for Word equations (Should); docx for Word files (ADR-012).</w:t>
+        <w:t>KaTeX for equations; mathml2omml for Word equations (Should); docx for Word files (ADR-012).</w:t>
       </w:r>
     </w:p>
     <w:p>
@@ -1518,7 +1571,7 @@
               <w:rPr>
                 <w:sz w:val="18"/>
               </w:rPr>
-              <w:t>User types in a 50-page document with tables and formulas, on the reference machine.</w:t>
+              <w:t>User types in a 50-page document with tables and equations, on the reference machine.</w:t>
             </w:r>
           </w:p>
         </w:tc>
@@ -1535,7 +1588,7 @@
               <w:rPr>
                 <w:sz w:val="18"/>
               </w:rPr>
-              <w:t>Character shows within 50 ms; formulas re-render only when their source changes.</w:t>
+              <w:t>Character shows within 50 ms; equations re-render only when their source changes.</w:t>
             </w:r>
           </w:p>
         </w:tc>
@@ -1847,7 +1900,7 @@
               <w:rPr>
                 <w:sz w:val="18"/>
               </w:rPr>
-              <w:t>Autosave is skipped; the user chooses Overwrite, Save As, or Cancel; nothing is overwritten silently.</w:t>
+              <w:t>Autosave is skipped; the user chooses Overwrite, Save as, or Cancel; nothing is overwritten silently.</w:t>
             </w:r>
           </w:p>
         </w:tc>
@@ -1934,7 +1987,7 @@
               <w:rPr>
                 <w:sz w:val="18"/>
               </w:rPr>
-              <w:t>User exports a document with 20 formulas to Word.</w:t>
+              <w:t>User exports a document with 20 equations to Word.</w:t>
             </w:r>
           </w:p>
         </w:tc>
@@ -1951,7 +2004,7 @@
               <w:rPr>
                 <w:sz w:val="18"/>
               </w:rPr>
-              <w:t>Each formula is an editable equation, or an image if conversion fails; done within 10 s.</w:t>
+              <w:t>Each equation is an editable equation, or an image if conversion fails; done within 10 s.</w:t>
             </w:r>
           </w:p>
         </w:tc>
@@ -2231,7 +2284,7 @@
     </w:p>
     <w:p>
       <w:r>
-        <w:t>Local-first modular monolith. One Electron main process owns all file, print, and export work. One sandboxed renderer per window owns the editor. They talk only over a narrow, typed IPC bridge exposed by the preload script. Every disk write goes through one tested helper (ADR-001, ADR-002). Untrusted content stays away from Node, and no server is needed, which matches NFR-05.</w:t>
+        <w:t>Local-first modular monolith. Dialogs, disk writes, print, and export stay in main. Decoding an .obk file runs in a utility process (spike S-08). One sandboxed renderer per window owns the editor. They talk only over a narrow, typed IPC bridge exposed by the preload script. Every disk write goes through one tested helper (ADR-001, ADR-002). Untrusted content stays away from Node, and no server is needed, which matches NFR-05.</w:t>
       </w:r>
     </w:p>
     <w:tbl>
@@ -2347,7 +2400,7 @@
               <w:rPr>
                 <w:sz w:val="19"/>
               </w:rPr>
-              <w:t>Window regions, menus, tab strip, status bar (including Autosave paused), Preferences and About tabs, prompts.</w:t>
+              <w:t>Window regions, menus, tab strip, status bar (including Autosave paused), Settings and About tabs, prompts.</w:t>
             </w:r>
           </w:p>
         </w:tc>
@@ -2453,7 +2506,7 @@
               <w:rPr>
                 <w:sz w:val="19"/>
               </w:rPr>
-              <w:t>Views for tables (with the TableMath module), images, columns, drawing, signatures, date chips, and diagrams (Mermaid, strict). Makes first-frame PNGs of animated images for export.</w:t>
+              <w:t>Views for tables (with the TableMath module), images, columns, drawing, signatures, date and time items, and diagrams (Mermaid, strict). Makes first-frame PNGs of animated images for export.</w:t>
             </w:r>
           </w:p>
         </w:tc>
@@ -2506,7 +2559,7 @@
               <w:rPr>
                 <w:sz w:val="19"/>
               </w:rPr>
-              <w:t>KaTeX rendering with fixed settings (section 6.4), live preview, errors; MathML and PNG for export.</w:t>
+              <w:t>KaTeX rendering for equation blocks and inline equations with fixed settings (section 6.4), live preview, errors; MathML and PNG for export.</w:t>
             </w:r>
           </w:p>
         </w:tc>
@@ -2684,7 +2737,7 @@
               <w:rPr>
                 <w:sz w:val="19"/>
               </w:rPr>
-              <w:t>FileService</w:t>
+              <w:t>Link opener</w:t>
             </w:r>
           </w:p>
         </w:tc>
@@ -2718,7 +2771,33 @@
               <w:rPr>
                 <w:sz w:val="19"/>
               </w:rPr>
-              <w:t>Open, Save, and Export dialogs; the handle-to-path map; disk-change check; file activation and session restore; the shared atomic-write helper writeAtomic.</w:t>
+              <w:t xml:space="preserve">Owns </w:t>
+            </w:r>
+            <w:r>
+              <w:rPr>
+                <w:rFonts w:ascii="Consolas" w:hAnsi="Consolas"/>
+                <w:sz w:val="19"/>
+              </w:rPr>
+              <w:t>link:open</w:t>
+            </w:r>
+            <w:r>
+              <w:rPr>
+                <w:sz w:val="19"/>
+              </w:rPr>
+              <w:t xml:space="preserve"> (</w:t>
+            </w:r>
+            <w:r>
+              <w:rPr>
+                <w:rFonts w:ascii="Consolas" w:hAnsi="Consolas"/>
+                <w:sz w:val="19"/>
+              </w:rPr>
+              <w:t>src/main/security/links.ts</w:t>
+            </w:r>
+            <w:r>
+              <w:rPr>
+                <w:sz w:val="19"/>
+              </w:rPr>
+              <w:t>): shows the full address, asks the user, and opens only allowlisted schemes in the default browser or mail app.</w:t>
             </w:r>
           </w:p>
         </w:tc>
@@ -2737,6 +2816,59 @@
               <w:rPr>
                 <w:sz w:val="19"/>
               </w:rPr>
+              <w:t>FileService</w:t>
+            </w:r>
+          </w:p>
+        </w:tc>
+        <w:tc>
+          <w:tcPr>
+            <w:tcW w:type="dxa" w:w="1296"/>
+            <w:vAlign w:val="top"/>
+          </w:tcPr>
+          <w:p>
+            <w:pPr>
+              <w:spacing w:after="40"/>
+            </w:pPr>
+            <w:r>
+              <w:rPr>
+                <w:sz w:val="19"/>
+              </w:rPr>
+              <w:t>Main</w:t>
+            </w:r>
+          </w:p>
+        </w:tc>
+        <w:tc>
+          <w:tcPr>
+            <w:tcW w:type="dxa" w:w="5904"/>
+            <w:vAlign w:val="top"/>
+          </w:tcPr>
+          <w:p>
+            <w:pPr>
+              <w:spacing w:after="40"/>
+            </w:pPr>
+            <w:r>
+              <w:rPr>
+                <w:sz w:val="19"/>
+              </w:rPr>
+              <w:t>Open, Save, and Export dialogs; the handle-to-path map; disk-change check; file activation and session restore; the shared atomic-write helper writeAtomic.</w:t>
+            </w:r>
+          </w:p>
+        </w:tc>
+      </w:tr>
+      <w:tr>
+        <w:tc>
+          <w:tcPr>
+            <w:tcW w:type="dxa" w:w="2160"/>
+            <w:vAlign w:val="top"/>
+          </w:tcPr>
+          <w:p>
+            <w:pPr>
+              <w:spacing w:after="40"/>
+            </w:pPr>
+            <w:r>
+              <w:rPr>
+                <w:sz w:val="19"/>
+              </w:rPr>
               <w:t>FormatCodec</w:t>
             </w:r>
           </w:p>
@@ -2754,7 +2886,7 @@
               <w:rPr>
                 <w:sz w:val="19"/>
               </w:rPr>
-              <w:t>Main</w:t>
+              <w:t>Utility process</w:t>
             </w:r>
           </w:p>
         </w:tc>
@@ -2771,7 +2903,7 @@
               <w:rPr>
                 <w:sz w:val="19"/>
               </w:rPr>
-              <w:t>Encode and decode .obk files: archive caps, entry allowlist, schema, limits, image headers, and version conversion. Runs under Node.</w:t>
+              <w:t>Encode and decode .obk files: archive caps, entry allowlist, schema, limits, image headers, and version conversion. Decoding runs in an Electron utilityProcess so a crash or a large inflate stays off main and off the editor. yazl encoding was checked in that same process. Electron 45 does not OS-sandbox it (spike S-08). APPROVED 27 October 2026: decoding stays in that process. The main-process fallback is not taken. FileService still does the disk rename.</w:t>
             </w:r>
           </w:p>
         </w:tc>
@@ -3296,7 +3428,7 @@
         <w:t xml:space="preserve">Limitation: </w:t>
       </w:r>
       <w:r>
-        <w:t>Save As and the first Save add the Save dialog and the replace prompt before this flow.</w:t>
+        <w:t>Save as and the first Save add the Save dialog and the replace prompt before this flow.</w:t>
       </w:r>
     </w:p>
     <w:p>
@@ -3371,7 +3503,7 @@
         <w:t xml:space="preserve">Purpose: </w:t>
       </w:r>
       <w:r>
-        <w:t>Shows how formulas reach Word as equations or images, through the IPC bridge.</w:t>
+        <w:t>Shows how equations reach Word as equations or images, through the IPC bridge.</w:t>
       </w:r>
     </w:p>
     <w:p>
@@ -3587,19 +3719,62 @@
         <w:t xml:space="preserve">Limitation: </w:t>
       </w:r>
       <w:r>
-        <w:t>MSIX redirection of app data is from Microsoft docs, not yet tested here.</w:t>
+        <w:t>Checked in spike S-01. Documents and a local folder are not redirected. App data is.</w:t>
       </w:r>
     </w:p>
     <w:p>
       <w:r>
-        <w:rPr>
-          <w:b/>
-          <w:color w:val="B00000"/>
-        </w:rPr>
-        <w:t xml:space="preserve">UNVERIFIED: </w:t>
+        <w:t xml:space="preserve">Checked in spike S-01 on 27 October 2026, Windows 11 Home 10.0.26300, Electron 45.0.0, commit 8f4c177. MSIX did not redirect Documents or the local Desktop. Documents on that PC is OneDrive Known Folder Move, </w:t>
       </w:r>
       <w:r>
-        <w:t>MSIX redirects writes to app data but not to user folders such as Documents. Check in spike S-01; source: Microsoft MSIX docs.</w:t>
+        <w:rPr>
+          <w:rFonts w:ascii="Consolas" w:hAnsi="Consolas"/>
+          <w:sz w:val="20"/>
+        </w:rPr>
+        <w:t>C:\Users\filli\OneDrive\Documents</w:t>
+      </w:r>
+      <w:r>
+        <w:t xml:space="preserve">, and </w:t>
+      </w:r>
+      <w:r>
+        <w:rPr>
+          <w:rFonts w:ascii="Consolas" w:hAnsi="Consolas"/>
+          <w:sz w:val="20"/>
+        </w:rPr>
+        <w:t>app.getPath('documents')</w:t>
+      </w:r>
+      <w:r>
+        <w:t xml:space="preserve"> returned that path. The second folder was the plain local Desktop.</w:t>
+      </w:r>
+    </w:p>
+    <w:p>
+      <w:r>
+        <w:t xml:space="preserve">It did redirect </w:t>
+      </w:r>
+      <w:r>
+        <w:rPr>
+          <w:rFonts w:ascii="Consolas" w:hAnsi="Consolas"/>
+          <w:sz w:val="20"/>
+        </w:rPr>
+        <w:t>app.getPath('userData')</w:t>
+      </w:r>
+      <w:r>
+        <w:t>, Roaming, and Local into the package LocalCache (</w:t>
+      </w:r>
+      <w:r>
+        <w:rPr>
+          <w:rFonts w:ascii="Consolas" w:hAnsi="Consolas"/>
+          <w:sz w:val="20"/>
+        </w:rPr>
+        <w:t>...\Packages\Obelisk.SpikeS01_09826e2d9xne4\LocalCache\</w:t>
+      </w:r>
+      <w:r>
+        <w:t>). Those files are private to the package and are removed on uninstall. Settings and recovery files can live there. A document must not default to AppData.</w:t>
+      </w:r>
+    </w:p>
+    <w:p>
+      <w:r>
+        <w:t>A dev-signed MSIX does not start while Smart App Control is enforcing, including through the app execution alias (spike S-07, Windows 11 Home 10.0.26300). Manual testing on that PC needs Smart App Control off, or a signature Windows trusts. Scripts launch the app through the alias, not the path under WindowsApps.</w:t>
       </w:r>
     </w:p>
     <w:p>
@@ -3685,7 +3860,7 @@
         <w:t xml:space="preserve">Assumption: </w:t>
       </w:r>
       <w:r>
-        <w:t>Preferences and About open as tabs, not windows.</w:t>
+        <w:t>Settings and About open as tabs, not windows.</w:t>
       </w:r>
     </w:p>
     <w:p>
@@ -3897,7 +4072,7 @@
               <w:rPr>
                 <w:sz w:val="19"/>
               </w:rPr>
-              <w:t>file:save, called by Save, Save As, and the renderer's autosave timer; one path (ADR-002)</w:t>
+              <w:t>file:save, called by Save, Save as, and the renderer's autosave timer; one path (ADR-002)</w:t>
             </w:r>
           </w:p>
         </w:tc>
@@ -4162,7 +4337,7 @@
               <w:rPr>
                 <w:sz w:val="19"/>
               </w:rPr>
-              <w:t>On EPERM or EBUSY during the rename (antivirus, indexer): 3 tries, 100 ms apart, then EBUSY_EXHAUSTED</w:t>
+              <w:t>On EPERM, EBUSY, or EACCES during the rename (antivirus, indexer, or a brief lock): 3 tries, 100 ms apart, then EBUSY_EXHAUSTED. One rename in the OneDrive Documents folder failed once with EPERM, and the next try replaced the file (spike S-01). If the tries are used up, show the error, keep the previous file, and delete the temp file.</w:t>
             </w:r>
           </w:p>
         </w:tc>
@@ -4306,7 +4481,7 @@
               <w:rPr>
                 <w:sz w:val="19"/>
               </w:rPr>
-              <w:t>Same call with the tab handle. On conflict it shows the choice once, pauses autosave for that tab, and the status bar shows Autosave paused. It resumes after the next successful Save, Overwrite, or Save As</w:t>
+              <w:t>Same call with the tab handle. On conflict it shows the choice once, pauses autosave for that tab, and the status bar shows Autosave paused. It resumes after the next successful Save, Overwrite, or Save as</w:t>
             </w:r>
           </w:p>
         </w:tc>
@@ -4355,14 +4530,17 @@
     </w:p>
     <w:p>
       <w:r>
-        <w:rPr>
-          <w:b/>
-          <w:color w:val="B00000"/>
-        </w:rPr>
-        <w:t xml:space="preserve">UNVERIFIED: </w:t>
+        <w:t xml:space="preserve">Checked in spike S-01 on the same build as section 5.6. In the packaged MSIX, writeAtomic's temp file and rename landed in the real Documents folder and in the second folder. Get-Item from outside the package opened those paths, the hashes matched, and the paths were not under the package LocalCache. The outside watcher saw only complete payloads during the replaces. </w:t>
       </w:r>
       <w:r>
-        <w:t>That fs.rename over an existing file maps to an atomic replace (MoveFileEx with replace) on NTFS from an MSIX-packaged app. Check in spike S-01; source: Node.js fs docs and libuv.</w:t>
+        <w:rPr>
+          <w:rFonts w:ascii="Consolas" w:hAnsi="Consolas"/>
+          <w:sz w:val="20"/>
+        </w:rPr>
+        <w:t>fs.rename</w:t>
+      </w:r>
+      <w:r>
+        <w:t xml:space="preserve"> over the existing file is the one replace step on those folders.</w:t>
       </w:r>
     </w:p>
     <w:p>
@@ -4486,7 +4664,7 @@
               <w:rPr>
                 <w:sz w:val="19"/>
               </w:rPr>
-              <w:t>Return conflict; the user picks Overwrite (save with the new stat), Save As, or Cancel</w:t>
+              <w:t>Return conflict; the user picks Overwrite (save with the new stat), Save as, or Cancel</w:t>
             </w:r>
           </w:p>
         </w:tc>
@@ -4539,7 +4717,46 @@
               <w:rPr>
                 <w:sz w:val="19"/>
               </w:rPr>
-              <w:t>Return exists; write nothing; file:saveAs shows the replace prompt and calls again after Replace</w:t>
+              <w:t xml:space="preserve">Return exists; write nothing. On Windows, Electron 45 sets </w:t>
+            </w:r>
+            <w:r>
+              <w:rPr>
+                <w:rFonts w:ascii="Consolas" w:hAnsi="Consolas"/>
+                <w:sz w:val="19"/>
+              </w:rPr>
+              <w:t>FOS_OVERWRITEPROMPT</w:t>
+            </w:r>
+            <w:r>
+              <w:rPr>
+                <w:sz w:val="19"/>
+              </w:rPr>
+              <w:t xml:space="preserve"> on every save dialog. </w:t>
+            </w:r>
+            <w:r>
+              <w:rPr>
+                <w:rFonts w:ascii="Consolas" w:hAnsi="Consolas"/>
+                <w:sz w:val="19"/>
+              </w:rPr>
+              <w:t>showSaveDialog</w:t>
+            </w:r>
+            <w:r>
+              <w:rPr>
+                <w:sz w:val="19"/>
+              </w:rPr>
+              <w:t xml:space="preserve"> is owned by the app window, and that prompt is the confirmation (spike S-05). </w:t>
+            </w:r>
+            <w:r>
+              <w:rPr>
+                <w:rFonts w:ascii="Consolas" w:hAnsi="Consolas"/>
+                <w:sz w:val="19"/>
+              </w:rPr>
+              <w:t>showOverwriteConfirmation</w:t>
+            </w:r>
+            <w:r>
+              <w:rPr>
+                <w:sz w:val="19"/>
+              </w:rPr>
+              <w:t xml:space="preserve"> is not read on Windows. Main sets replaceConfirmed when the dialog returns the path. A canceled dialog writes nothing. The dialog itself does not write the file. Obelisk does not show a second prompt. On another platform, or if the Windows prompt stops staying until a click, Main shows Obelisk's own prompt before writing.</w:t>
             </w:r>
           </w:p>
         </w:tc>
@@ -4628,7 +4845,7 @@
               <w:rPr>
                 <w:sz w:val="19"/>
               </w:rPr>
-              <w:t>Disk full, access denied, path gone, retries used up, document fails the schema</w:t>
+              <w:t>Disk full, access denied, path gone, retries used up, document fails the schema, a read-only target, or a file another program has open</w:t>
             </w:r>
           </w:p>
         </w:tc>
@@ -4645,7 +4862,7 @@
               <w:rPr>
                 <w:sz w:val="19"/>
               </w:rPr>
-              <w:t>Return error with its code; temp file removed; Retry offered when retryable</w:t>
+              <w:t>Return error with its code; temp file removed; the previous file stays; Retry offered when retryable. A read-only target and a file held open both returned EPERM (errno -4048) in spike S-01. The message says which of those two it is.</w:t>
             </w:r>
           </w:p>
         </w:tc>
@@ -4761,6 +4978,41 @@
       <w:pPr>
         <w:spacing w:after="40"/>
       </w:pPr>
+    </w:p>
+    <w:p>
+      <w:r>
+        <w:t xml:space="preserve">Spike S-05 also tried an existing </w:t>
+      </w:r>
+      <w:r>
+        <w:rPr>
+          <w:rFonts w:ascii="Consolas" w:hAnsi="Consolas"/>
+          <w:sz w:val="20"/>
+        </w:rPr>
+        <w:t>.obk</w:t>
+      </w:r>
+      <w:r>
+        <w:t xml:space="preserve"> name with a Word </w:t>
+      </w:r>
+      <w:r>
+        <w:rPr>
+          <w:rFonts w:ascii="Consolas" w:hAnsi="Consolas"/>
+          <w:sz w:val="20"/>
+        </w:rPr>
+        <w:t>.docx</w:t>
+      </w:r>
+      <w:r>
+        <w:t xml:space="preserve"> filter. Windows kept the </w:t>
+      </w:r>
+      <w:r>
+        <w:rPr>
+          <w:rFonts w:ascii="Consolas" w:hAnsi="Consolas"/>
+          <w:sz w:val="20"/>
+        </w:rPr>
+        <w:t>.obk</w:t>
+      </w:r>
+      <w:r>
+        <w:t xml:space="preserve"> name and asked to replace that file. Export sets the extension itself. It does not rely on the filter.</w:t>
+      </w:r>
     </w:p>
     <w:p>
       <w:pPr>
@@ -5060,7 +5312,7 @@
               <w:rPr>
                 <w:sz w:val="18"/>
               </w:rPr>
-              <w:t>Main shows the Save dialog and replace prompt, then saves: file:save results with a new handle and name, or cancelled</w:t>
+              <w:t>Main shows the Save dialog, owned by the app window. On Windows that dialog is the replace prompt (spike S-05). Main sets replaceConfirmed when it returns an existing path, then saves: file:save results with a new handle and name, or cancelled</w:t>
             </w:r>
           </w:p>
         </w:tc>
@@ -6107,7 +6359,7 @@
         <w:spacing w:after="60"/>
       </w:pPr>
       <w:r>
-        <w:t>Content Security Policy: default-src 'none'; scripts, styles, and fonts from app: only; images from app:, data:, and blob:; no connect, frame, or object sources.</w:t>
+        <w:t>Content Security Policy: default-src 'none'; script-src app:; style-src-elem app: plus a per-render nonce; style-src-attr 'none'; fonts from app: only; images from app:, data:, and blob:; no connect, frame, or object sources. No 'unsafe-inline' and no 'unsafe-eval'. Spike S-04.</w:t>
       </w:r>
     </w:p>
     <w:p>
@@ -6170,7 +6422,27 @@
         <w:spacing w:after="60"/>
       </w:pPr>
       <w:r>
-        <w:t>Command-line arguments: only existing regular .obk files are taken, up to 20 per launch; other arguments are ignored.</w:t>
+        <w:t xml:space="preserve">Command-line arguments: only existing regular .obk files are taken, up to 20 per launch; other arguments are ignored. In </w:t>
+      </w:r>
+      <w:r>
+        <w:rPr>
+          <w:rFonts w:ascii="Consolas" w:hAnsi="Consolas"/>
+          <w:sz w:val="20"/>
+        </w:rPr>
+        <w:t>second-instance</w:t>
+      </w:r>
+      <w:r>
+        <w:t xml:space="preserve">, Chromium switches come before the path, so main picks file paths out of argv by filtering, never by a fixed index. A relative path is not resolved against the working directory. Explorer set that directory to </w:t>
+      </w:r>
+      <w:r>
+        <w:rPr>
+          <w:rFonts w:ascii="Consolas" w:hAnsi="Consolas"/>
+          <w:sz w:val="20"/>
+        </w:rPr>
+        <w:t>C:\WINDOWS\System32</w:t>
+      </w:r>
+      <w:r>
+        <w:t xml:space="preserve"> (spike S-02). Selecting several files delivers one event per file.</w:t>
       </w:r>
     </w:p>
     <w:p>
@@ -6746,14 +7018,312 @@
     </w:p>
     <w:p>
       <w:r>
-        <w:rPr>
-          <w:b/>
-          <w:color w:val="B00000"/>
-        </w:rPr>
-        <w:t xml:space="preserve">UNVERIFIED: </w:t>
+        <w:t xml:space="preserve">Checked in spike S-04 (Mermaid 12.2.0, KaTeX 0.19.1, Electron 45.0.0). CI run 40464232909, commit 912eabd, measured the flowchart before the allowlist. The merged note (commit 5db8131) remeasures </w:t>
       </w:r>
       <w:r>
-        <w:t>Which style-src KaTeX output needs under this policy, and whether Mermaid strict output needs any. Check in spike S-04.</w:t>
+        <w:rPr>
+          <w:rFonts w:ascii="Consolas" w:hAnsi="Consolas"/>
+          <w:sz w:val="20"/>
+        </w:rPr>
+        <w:t>rewrite-nonce</w:t>
+      </w:r>
+      <w:r>
+        <w:t xml:space="preserve"> after the allowlist and the selector prefix, and the job fails if that check does not pass. On the local sandboxed host the flowchart was 186 by 467, fill </w:t>
+      </w:r>
+      <w:r>
+        <w:rPr>
+          <w:rFonts w:ascii="Consolas" w:hAnsi="Consolas"/>
+          <w:sz w:val="20"/>
+        </w:rPr>
+        <w:t>rgb(51, 51, 51)</w:t>
+      </w:r>
+      <w:r>
+        <w:t>, with no style attributes left.</w:t>
+      </w:r>
+    </w:p>
+    <w:p>
+      <w:r>
+        <w:t xml:space="preserve">Under </w:t>
+      </w:r>
+      <w:r>
+        <w:rPr>
+          <w:rFonts w:ascii="Consolas" w:hAnsi="Consolas"/>
+          <w:sz w:val="20"/>
+        </w:rPr>
+        <w:t>style-src app:</w:t>
+      </w:r>
+      <w:r>
+        <w:t xml:space="preserve">, with </w:t>
+      </w:r>
+      <w:r>
+        <w:rPr>
+          <w:rFonts w:ascii="Consolas" w:hAnsi="Consolas"/>
+          <w:sz w:val="20"/>
+        </w:rPr>
+        <w:t>script-src app:</w:t>
+      </w:r>
+      <w:r>
+        <w:t xml:space="preserve"> and the network off, KaTeX rendered the Equation reference samples (HTML and MathML) from </w:t>
+      </w:r>
+      <w:r>
+        <w:rPr>
+          <w:rFonts w:ascii="Consolas" w:hAnsi="Consolas"/>
+          <w:sz w:val="20"/>
+        </w:rPr>
+        <w:t>app:</w:t>
+      </w:r>
+      <w:r>
+        <w:t xml:space="preserve"> fonts. Mermaid at </w:t>
+      </w:r>
+      <w:r>
+        <w:rPr>
+          <w:rFonts w:ascii="Consolas" w:hAnsi="Consolas"/>
+          <w:sz w:val="20"/>
+        </w:rPr>
+        <w:t>securityLevel: 'strict'</w:t>
+      </w:r>
+      <w:r>
+        <w:t xml:space="preserve"> returned an SVG for the diagram types tried. The flowchart's theme style element and its </w:t>
+      </w:r>
+      <w:r>
+        <w:rPr>
+          <w:rFonts w:ascii="Consolas" w:hAnsi="Consolas"/>
+          <w:sz w:val="20"/>
+        </w:rPr>
+        <w:t>max-width</w:t>
+      </w:r>
+      <w:r>
+        <w:t xml:space="preserve"> attribute were both blocked.</w:t>
+      </w:r>
+    </w:p>
+    <w:p>
+      <w:r>
+        <w:t>The chosen path moves those style attributes into the diagram stylesheet. It keeps only drawing properties: fill, fill-opacity, fill-rule, stroke, stroke-width, stroke-dasharray, stroke-dashoffset, stroke-linecap, stroke-linejoin, stroke-miterlimit, stroke-opacity, opacity, color, font-family, font-size, font-weight, font-style, text-anchor, dominant-baseline, width, height, max-width, min-width, max-height, and min-height.</w:t>
+      </w:r>
+    </w:p>
+    <w:p>
+      <w:r>
+        <w:t xml:space="preserve">It drops </w:t>
+      </w:r>
+      <w:r>
+        <w:rPr>
+          <w:rFonts w:ascii="Consolas" w:hAnsi="Consolas"/>
+          <w:sz w:val="20"/>
+        </w:rPr>
+        <w:t>url()</w:t>
+      </w:r>
+      <w:r>
+        <w:t xml:space="preserve">, </w:t>
+      </w:r>
+      <w:r>
+        <w:rPr>
+          <w:rFonts w:ascii="Consolas" w:hAnsi="Consolas"/>
+          <w:sz w:val="20"/>
+        </w:rPr>
+        <w:t>@import</w:t>
+      </w:r>
+      <w:r>
+        <w:t xml:space="preserve">, </w:t>
+      </w:r>
+      <w:r>
+        <w:rPr>
+          <w:rFonts w:ascii="Consolas" w:hAnsi="Consolas"/>
+          <w:sz w:val="20"/>
+        </w:rPr>
+        <w:t>position</w:t>
+      </w:r>
+      <w:r>
+        <w:t xml:space="preserve">, </w:t>
+      </w:r>
+      <w:r>
+        <w:rPr>
+          <w:rFonts w:ascii="Consolas" w:hAnsi="Consolas"/>
+          <w:sz w:val="20"/>
+        </w:rPr>
+        <w:t>content</w:t>
+      </w:r>
+      <w:r>
+        <w:t xml:space="preserve">, </w:t>
+      </w:r>
+      <w:r>
+        <w:rPr>
+          <w:rFonts w:ascii="Consolas" w:hAnsi="Consolas"/>
+          <w:sz w:val="20"/>
+        </w:rPr>
+        <w:t>display</w:t>
+      </w:r>
+      <w:r>
+        <w:t xml:space="preserve">, and any declaration or selector that contains </w:t>
+      </w:r>
+      <w:r>
+        <w:rPr>
+          <w:rFonts w:ascii="Consolas" w:hAnsi="Consolas"/>
+          <w:sz w:val="20"/>
+        </w:rPr>
+        <w:t>{</w:t>
+      </w:r>
+      <w:r>
+        <w:t xml:space="preserve">, </w:t>
+      </w:r>
+      <w:r>
+        <w:rPr>
+          <w:rFonts w:ascii="Consolas" w:hAnsi="Consolas"/>
+          <w:sz w:val="20"/>
+        </w:rPr>
+        <w:t>}</w:t>
+      </w:r>
+      <w:r>
+        <w:t xml:space="preserve">, or </w:t>
+      </w:r>
+      <w:r>
+        <w:rPr>
+          <w:rFonts w:ascii="Consolas" w:hAnsi="Consolas"/>
+          <w:sz w:val="20"/>
+        </w:rPr>
+        <w:t>&lt;</w:t>
+      </w:r>
+      <w:r>
+        <w:t xml:space="preserve">. Every selector is prefixed with the diagram id. That one style element is allowed with a per-render nonce. On that path the sample flowchart measured 186 by 467 with fill </w:t>
+      </w:r>
+      <w:r>
+        <w:rPr>
+          <w:rFonts w:ascii="Consolas" w:hAnsi="Consolas"/>
+          <w:sz w:val="20"/>
+        </w:rPr>
+        <w:t>#333</w:t>
+      </w:r>
+      <w:r>
+        <w:t>.</w:t>
+      </w:r>
+    </w:p>
+    <w:p>
+      <w:r>
+        <w:t xml:space="preserve">Layout is dagre. Do not set </w:t>
+      </w:r>
+      <w:r>
+        <w:rPr>
+          <w:rFonts w:ascii="Consolas" w:hAnsi="Consolas"/>
+          <w:sz w:val="20"/>
+        </w:rPr>
+        <w:t>layout</w:t>
+      </w:r>
+      <w:r>
+        <w:t xml:space="preserve"> to elk, and do not ship elkjs (APPROVED 27 October 2026). Before render, strip </w:t>
+      </w:r>
+      <w:r>
+        <w:rPr>
+          <w:rFonts w:ascii="Consolas" w:hAnsi="Consolas"/>
+          <w:sz w:val="20"/>
+        </w:rPr>
+        <w:t>click</w:t>
+      </w:r>
+      <w:r>
+        <w:t xml:space="preserve"> lines and </w:t>
+      </w:r>
+      <w:r>
+        <w:rPr>
+          <w:rFonts w:ascii="Consolas" w:hAnsi="Consolas"/>
+          <w:sz w:val="20"/>
+        </w:rPr>
+        <w:t>href</w:t>
+      </w:r>
+      <w:r>
+        <w:t xml:space="preserve"> values from the diagram source.</w:t>
+      </w:r>
+    </w:p>
+    <w:p>
+      <w:r>
+        <w:t xml:space="preserve">Mermaid 12.2.0, checked in spike S-04 on 27 October 2026: every GitHub advisory for mermaid-js/mermaid was patched at or before 11.16.1 (10.9.8 on the 10.x line). That includes the sequence XSS, the architecture </w:t>
+      </w:r>
+      <w:r>
+        <w:rPr>
+          <w:rFonts w:ascii="Consolas" w:hAnsi="Consolas"/>
+          <w:sz w:val="20"/>
+        </w:rPr>
+        <w:t>iconText</w:t>
+      </w:r>
+      <w:r>
+        <w:t xml:space="preserve"> XSS, the </w:t>
+      </w:r>
+      <w:r>
+        <w:rPr>
+          <w:rFonts w:ascii="Consolas" w:hAnsi="Consolas"/>
+          <w:sz w:val="20"/>
+        </w:rPr>
+        <w:t>classDef</w:t>
+      </w:r>
+      <w:r>
+        <w:t xml:space="preserve"> CSS injection, and the sibling-CSS injection. </w:t>
+      </w:r>
+      <w:r>
+        <w:rPr>
+          <w:rFonts w:ascii="Consolas" w:hAnsi="Consolas"/>
+          <w:sz w:val="20"/>
+        </w:rPr>
+        <w:t>npm audit</w:t>
+      </w:r>
+      <w:r>
+        <w:t xml:space="preserve"> of that tree reported 0 vulnerabilities. Check again when the app pins a version.</w:t>
+      </w:r>
+    </w:p>
+    <w:p>
+      <w:r>
+        <w:t xml:space="preserve">Checked in spike S-08 (Electron 45.0.0, yauzl 3.4.0, yazl 3.3.1, Windows image 20261021.278.1, CI runs 40442767845 and 40443190314). Decoding runs in a utilityProcess, for crash and memory isolation from main. That process is not OS-sandboxed in Electron 45. </w:t>
+      </w:r>
+      <w:r>
+        <w:rPr>
+          <w:rFonts w:ascii="Consolas" w:hAnsi="Consolas"/>
+          <w:sz w:val="20"/>
+        </w:rPr>
+        <w:t>utilityProcess.fork</w:t>
+      </w:r>
+      <w:r>
+        <w:t xml:space="preserve"> has no sandbox option. On Windows, </w:t>
+      </w:r>
+      <w:r>
+        <w:rPr>
+          <w:rFonts w:ascii="Consolas" w:hAnsi="Consolas"/>
+          <w:sz w:val="20"/>
+        </w:rPr>
+        <w:t>getAppMetrics()</w:t>
+      </w:r>
+      <w:r>
+        <w:t xml:space="preserve"> reports </w:t>
+      </w:r>
+      <w:r>
+        <w:rPr>
+          <w:rFonts w:ascii="Consolas" w:hAnsi="Consolas"/>
+          <w:sz w:val="20"/>
+        </w:rPr>
+        <w:t>sandboxed: false</w:t>
+      </w:r>
+      <w:r>
+        <w:t xml:space="preserve"> and integrity level </w:t>
+      </w:r>
+      <w:r>
+        <w:rPr>
+          <w:rFonts w:ascii="Consolas" w:hAnsi="Consolas"/>
+          <w:sz w:val="20"/>
+        </w:rPr>
+        <w:t>high</w:t>
+      </w:r>
+      <w:r>
+        <w:t xml:space="preserve">. On Linux the command line contains </w:t>
+      </w:r>
+      <w:r>
+        <w:rPr>
+          <w:rFonts w:ascii="Consolas" w:hAnsi="Consolas"/>
+          <w:sz w:val="20"/>
+        </w:rPr>
+        <w:t>--service-sandbox-type=none</w:t>
+      </w:r>
+      <w:r>
+        <w:t xml:space="preserve"> and Seccomp is 0.</w:t>
+      </w:r>
+    </w:p>
+    <w:p>
+      <w:r>
+        <w:t>The defence is the hostile-file checks and the real-byte caps. yauzl and yazl passed H-01 to H-09, those caps, a byte-identical 200-image save, and unchanged refused files, under Node 22.23.4 and inside that utility process. ADR-013 stays. APPROVED 27 October 2026: decoding stays in the utility process. The main-process fallback is not taken.</w:t>
       </w:r>
     </w:p>
     <w:p>
@@ -6765,7 +7335,7 @@
         <w:t xml:space="preserve">UNVERIFIED: </w:t>
       </w:r>
       <w:r>
-        <w:t>Fuses other than runAsNode and nodeCliInspect, and Mermaid's security advisories. Check when versions are pinned.</w:t>
+        <w:t>Fuses other than runAsNode and nodeCliInspect. Check when versions are pinned.</w:t>
       </w:r>
     </w:p>
     <w:p>
@@ -6778,18 +7348,6 @@
       </w:r>
       <w:r>
         <w:t>How printToPDF sets up its window, how the parser used for pasted HTML treats scripts, and how custom clipboard formats behave. Check in the chosen Electron version.</w:t>
-      </w:r>
-    </w:p>
-    <w:p>
-      <w:r>
-        <w:rPr>
-          <w:b/>
-          <w:color w:val="B00000"/>
-        </w:rPr>
-        <w:t xml:space="preserve">UNVERIFIED: </w:t>
-      </w:r>
-      <w:r>
-        <w:t>Decoding .obk files in a sandboxed utilityProcess instead of main. Check in spike S-08.</w:t>
       </w:r>
     </w:p>
     <w:p>
@@ -9425,6 +9983,53 @@
         <w:t>The same checks run on open, on recovery and session restore, on pasted Obelisk blocks, and on every document main receives to save.</w:t>
       </w:r>
     </w:p>
+    <w:p>
+      <w:pPr>
+        <w:pStyle w:val="ListBullet"/>
+        <w:spacing w:after="60"/>
+      </w:pPr>
+      <w:r>
+        <w:t xml:space="preserve">Spike S-08 applied those rules with yauzl 3.4.0 and yazl 3.3.1. yauzl is opened with </w:t>
+      </w:r>
+      <w:r>
+        <w:rPr>
+          <w:rFonts w:ascii="Consolas" w:hAnsi="Consolas"/>
+          <w:sz w:val="20"/>
+        </w:rPr>
+        <w:t>validateEntrySizes</w:t>
+      </w:r>
+      <w:r>
+        <w:t xml:space="preserve"> off, so a forged small declared size cannot hide a bomb from the 25 MB, 20 MB, and 250 MB caps. An entry that finishes under the cap but does not match its declared size is refused. The codec computes the CRC while it reads.</w:t>
+      </w:r>
+    </w:p>
+    <w:p>
+      <w:pPr>
+        <w:pStyle w:val="ListBullet"/>
+        <w:spacing w:after="60"/>
+      </w:pPr>
+      <w:r>
+        <w:t xml:space="preserve">Names are the central-directory bytes, read as Latin-1, and classified by FormatCodec. That is what refuses </w:t>
+      </w:r>
+      <w:r>
+        <w:rPr>
+          <w:rFonts w:ascii="Consolas" w:hAnsi="Consolas"/>
+          <w:sz w:val="20"/>
+        </w:rPr>
+        <w:t>../</w:t>
+      </w:r>
+      <w:r>
+        <w:t>, a leading slash, a backslash, a drive letter, a network path, a stream suffix, a device name such as CON, and a case duplicate. yauzl is not asked to rewrite names first.</w:t>
+      </w:r>
+    </w:p>
+    <w:p>
+      <w:pPr>
+        <w:pStyle w:val="ListBullet"/>
+        <w:spacing w:after="60"/>
+      </w:pPr>
+      <w:r>
+        <w:t>yazl writes a legitimate archive with a fixed modified time. Two saves of a 200-image document were byte-identical inside one runtime (spike S-08). They are not required to match across Node and Electron.</w:t>
+      </w:r>
+    </w:p>
     <w:tbl>
       <w:tblPr>
         <w:tblStyle w:val="TableGrid"/>
@@ -10028,14 +10633,62 @@
     </w:p>
     <w:p>
       <w:r>
-        <w:rPr>
-          <w:b/>
-          <w:color w:val="B00000"/>
-        </w:rPr>
-        <w:t xml:space="preserve">UNVERIFIED: </w:t>
+        <w:t>Checked in spike S-06 (Electron 45.0.0, Chrome 156.0.8078.48, Windows image 20261021.278.1, Ubuntu image 20261023.334.3, CI run 40461995542).</w:t>
+      </w:r>
+    </w:p>
+    <w:p>
+      <w:r>
+        <w:t>GIF and WebP frame counts and frame sizes come from a container walk, before any pixel decode. Do not scan for a separator byte or for the letters ANMF.</w:t>
+      </w:r>
+    </w:p>
+    <w:p>
+      <w:r>
+        <w:t>GIF blocks follow GIF89a. Image descriptors are frames. LZW sub-blocks are skipped by length. A Netscape loop count is not a frame count. A GIF with no trailer is refused.</w:t>
+      </w:r>
+    </w:p>
+    <w:p>
+      <w:r>
+        <w:t>WebP chunks follow the RIFF container. The canvas comes from VP8X. Each ANMF rectangle is read from the frame header. x and y are in 2-pixel units. The VP8 or VP8L header inside the frame is peeked for the coded size. The RIFF size bounds the count. Chromium and libwebp 1.3.2 both ignore an ANMF chunk past it.</w:t>
+      </w:r>
+    </w:p>
+    <w:p>
+      <w:r>
+        <w:t>The limits in this section apply to those sizes: 8000 pixels on a side, 1,000 frames, 250 million pixels across the frames, and each frame inside the canvas. A coded size that disagrees with the ANMF box is refused, and the pixel sum uses the larger box. ANMF chunks with the VP8X animation bit clear are still counted, and the file is refused, because the renderer cannot decode it.</w:t>
+      </w:r>
+    </w:p>
+    <w:p>
+      <w:r>
+        <w:t xml:space="preserve">The first-frame PNG for Word, PDF, and print is made in the sandboxed renderer: </w:t>
       </w:r>
       <w:r>
-        <w:t>Counting GIF and WebP frames without decoding, and making the first frame in the renderer. Check in spike S-06.</w:t>
+        <w:rPr>
+          <w:rFonts w:ascii="Consolas" w:hAnsi="Consolas"/>
+          <w:sz w:val="20"/>
+        </w:rPr>
+        <w:t>ImageDecoder</w:t>
+      </w:r>
+      <w:r>
+        <w:t xml:space="preserve"> frame 0, drawn to a canvas at the canvas size, then </w:t>
+      </w:r>
+      <w:r>
+        <w:rPr>
+          <w:rFonts w:ascii="Consolas" w:hAnsi="Consolas"/>
+          <w:sz w:val="20"/>
+        </w:rPr>
+        <w:t>canvas.toBlob('image/png')</w:t>
+      </w:r>
+      <w:r>
+        <w:t xml:space="preserve">. The page had no Node. </w:t>
+      </w:r>
+      <w:r>
+        <w:rPr>
+          <w:rFonts w:ascii="Consolas" w:hAnsi="Consolas"/>
+          <w:sz w:val="20"/>
+        </w:rPr>
+        <w:t>process.sandboxed</w:t>
+      </w:r>
+      <w:r>
+        <w:t xml:space="preserve"> was true.</w:t>
       </w:r>
     </w:p>
     <w:p>
@@ -10200,7 +10853,7 @@
               <w:rPr>
                 <w:sz w:val="18"/>
               </w:rPr>
-              <w:t>Preferences</w:t>
+              <w:t>Settings</w:t>
             </w:r>
           </w:p>
         </w:tc>
@@ -10639,14 +11292,136 @@
     </w:p>
     <w:p>
       <w:r>
-        <w:rPr>
-          <w:b/>
-          <w:color w:val="B00000"/>
-        </w:rPr>
-        <w:t xml:space="preserve">UNVERIFIED: </w:t>
+        <w:t xml:space="preserve">Checked in spike S-07 on 27 October 2026, Windows 11 Home 10.0.26300, Electron 45.0.0, commit a9f81193dc9a9e668a11510128986084c26bb1cb, package Obelisk.SpikeS07 0.0.1.0. </w:t>
       </w:r>
       <w:r>
-        <w:t>safeStorage inside an MSIX package, including the temporarily unavailable state. Check in spike S-07.</w:t>
+        <w:rPr>
+          <w:rFonts w:ascii="Consolas" w:hAnsi="Consolas"/>
+          <w:sz w:val="20"/>
+        </w:rPr>
+        <w:t>encryptStringAsync</w:t>
+      </w:r>
+      <w:r>
+        <w:t xml:space="preserve"> and </w:t>
+      </w:r>
+      <w:r>
+        <w:rPr>
+          <w:rFonts w:ascii="Consolas" w:hAnsi="Consolas"/>
+          <w:sz w:val="20"/>
+        </w:rPr>
+        <w:t>decryptStringAsync</w:t>
+      </w:r>
+      <w:r>
+        <w:t xml:space="preserve"> round-tripped a signature in the packaged MSIX. The same ciphertext decrypted after a new process. The file held no readable name or PNG.</w:t>
+      </w:r>
+    </w:p>
+    <w:p>
+      <w:r>
+        <w:rPr>
+          <w:rFonts w:ascii="Consolas" w:hAnsi="Consolas"/>
+          <w:sz w:val="20"/>
+        </w:rPr>
+        <w:t>isEncryptionAvailable</w:t>
+      </w:r>
+      <w:r>
+        <w:t xml:space="preserve"> was true on that path. </w:t>
+      </w:r>
+      <w:r>
+        <w:rPr>
+          <w:rFonts w:ascii="Consolas" w:hAnsi="Consolas"/>
+          <w:sz w:val="20"/>
+        </w:rPr>
+        <w:t>isAsyncEncryptionAvailable</w:t>
+      </w:r>
+      <w:r>
+        <w:t xml:space="preserve"> was true too, including when the key was bad, so it is not the unavailable check. Check </w:t>
+      </w:r>
+      <w:r>
+        <w:rPr>
+          <w:rFonts w:ascii="Consolas" w:hAnsi="Consolas"/>
+          <w:sz w:val="20"/>
+        </w:rPr>
+        <w:t>isEncryptionAvailable</w:t>
+      </w:r>
+      <w:r>
+        <w:t xml:space="preserve"> before saving a signature.</w:t>
+      </w:r>
+    </w:p>
+    <w:p>
+      <w:r>
+        <w:t xml:space="preserve">A stored key that does not start with </w:t>
+      </w:r>
+      <w:r>
+        <w:rPr>
+          <w:rFonts w:ascii="Consolas" w:hAnsi="Consolas"/>
+          <w:sz w:val="20"/>
+        </w:rPr>
+        <w:t>DPAPI</w:t>
+      </w:r>
+      <w:r>
+        <w:t xml:space="preserve"> makes </w:t>
+      </w:r>
+      <w:r>
+        <w:rPr>
+          <w:rFonts w:ascii="Consolas" w:hAnsi="Consolas"/>
+          <w:sz w:val="20"/>
+        </w:rPr>
+        <w:t>isEncryptionAvailable</w:t>
+      </w:r>
+      <w:r>
+        <w:t xml:space="preserve"> false, and both encrypt and decrypt throw a generic error. A </w:t>
+      </w:r>
+      <w:r>
+        <w:rPr>
+          <w:rFonts w:ascii="Consolas" w:hAnsi="Consolas"/>
+          <w:sz w:val="20"/>
+        </w:rPr>
+        <w:t>DPAPI</w:t>
+      </w:r>
+      <w:r>
+        <w:t xml:space="preserve"> prefix that </w:t>
+      </w:r>
+      <w:r>
+        <w:rPr>
+          <w:rFonts w:ascii="Consolas" w:hAnsi="Consolas"/>
+          <w:sz w:val="20"/>
+        </w:rPr>
+        <w:t>CryptUnprotectData</w:t>
+      </w:r>
+      <w:r>
+        <w:t xml:space="preserve"> cannot open leaves </w:t>
+      </w:r>
+      <w:r>
+        <w:rPr>
+          <w:rFonts w:ascii="Consolas" w:hAnsi="Consolas"/>
+          <w:sz w:val="20"/>
+        </w:rPr>
+        <w:t>isEncryptionAvailable</w:t>
+      </w:r>
+      <w:r>
+        <w:t xml:space="preserve"> true, and the old ciphertext fails with </w:t>
+      </w:r>
+      <w:r>
+        <w:rPr>
+          <w:rFonts w:ascii="Consolas" w:hAnsi="Consolas"/>
+          <w:sz w:val="20"/>
+        </w:rPr>
+        <w:t>Error while decrypting the ciphertext provided to safeStorage.decryptStringAsync.</w:t>
+      </w:r>
+    </w:p>
+    <w:p>
+      <w:r>
+        <w:t xml:space="preserve">The temporarily unavailable string did not appear. </w:t>
+      </w:r>
+      <w:r>
+        <w:rPr>
+          <w:rFonts w:ascii="Consolas" w:hAnsi="Consolas"/>
+          <w:sz w:val="20"/>
+        </w:rPr>
+        <w:t>shouldReEncrypt</w:t>
+      </w:r>
+      <w:r>
+        <w:t xml:space="preserve"> was false. A bad key shows up only as a generic decrypt error, so any decrypt failure means the signature is unavailable: save nothing and delete nothing. Saved signatures keep ADR-007.</w:t>
       </w:r>
     </w:p>
     <w:p>
@@ -10681,7 +11456,7 @@
         <w:spacing w:after="60"/>
       </w:pPr>
       <w:r>
-        <w:t>One export interface, export(format, document, assets, target), reached only through export:run (ADR-006). Main shows the Export dialog and the replace prompt.</w:t>
+        <w:t>One export interface, export(format, document, assets, target), reached only through export:run (ADR-006). Main shows the Export dialog. On Windows the Save dialog's replace prompt is the confirmation, and Obelisk does not ask again (spike S-05). Export sets the file extension itself.</w:t>
       </w:r>
     </w:p>
     <w:p>
@@ -10708,7 +11483,64 @@
         <w:spacing w:after="60"/>
       </w:pPr>
       <w:r>
-        <w:t>Word text goes through the library's text functions only. Word, PDF, and print use the first frame of an animated image: a PNG made in the renderer at export time, checked by main, never stored.</w:t>
+        <w:t xml:space="preserve">Word text goes through the library's text functions only, after XML 1.0-illegal control characters are stripped. docx escapes </w:t>
+      </w:r>
+      <w:r>
+        <w:rPr>
+          <w:rFonts w:ascii="Consolas" w:hAnsi="Consolas"/>
+          <w:sz w:val="20"/>
+        </w:rPr>
+        <w:t>&lt;</w:t>
+      </w:r>
+      <w:r>
+        <w:t xml:space="preserve">, </w:t>
+      </w:r>
+      <w:r>
+        <w:rPr>
+          <w:rFonts w:ascii="Consolas" w:hAnsi="Consolas"/>
+          <w:sz w:val="20"/>
+        </w:rPr>
+        <w:t>&amp;</w:t>
+      </w:r>
+      <w:r>
+        <w:t xml:space="preserve">, and </w:t>
+      </w:r>
+      <w:r>
+        <w:rPr>
+          <w:rFonts w:ascii="Consolas" w:hAnsi="Consolas"/>
+          <w:sz w:val="20"/>
+        </w:rPr>
+        <w:t>]]&gt;</w:t>
+      </w:r>
+      <w:r>
+        <w:t>. Unpaired surrogates do not survive as surrogates (spike S-09). A file that still contains those control characters does not open in Word.</w:t>
+      </w:r>
+    </w:p>
+    <w:p>
+      <w:pPr>
+        <w:pStyle w:val="ListBullet"/>
+        <w:spacing w:after="60"/>
+      </w:pPr>
+      <w:r>
+        <w:t>The exporter sets Letter and the margins on the section. It sets the document font from the document, and each table to the text width (9360 twips on Letter with 1 inch margins). Pictures of equations, drawings, and diagrams are cropped to their content, with a small margin, and rendered at 2× or more.</w:t>
+      </w:r>
+    </w:p>
+    <w:p>
+      <w:pPr>
+        <w:pStyle w:val="ListBullet"/>
+        <w:spacing w:after="60"/>
+      </w:pPr>
+      <w:r>
+        <w:t>A checklist can export as a Segoe UI Symbol mark, read-only, or as a Word checkbox content control, clickable.</w:t>
+      </w:r>
+    </w:p>
+    <w:p>
+      <w:pPr>
+        <w:pStyle w:val="ListBullet"/>
+        <w:spacing w:after="60"/>
+      </w:pPr>
+      <w:r>
+        <w:t>Word, PDF, and print use the first frame of an animated image: a PNG made in the renderer at export time, checked by main, never stored.</w:t>
       </w:r>
     </w:p>
     <w:p>
@@ -12163,7 +12995,46 @@
               <w:rPr>
                 <w:sz w:val="18"/>
               </w:rPr>
-              <w:t>Export of text, alt text, and link text with Markdown and XML markup</w:t>
+              <w:t xml:space="preserve">Export of text, alt text, and link text with </w:t>
+            </w:r>
+            <w:r>
+              <w:rPr>
+                <w:rFonts w:ascii="Consolas" w:hAnsi="Consolas"/>
+                <w:sz w:val="18"/>
+              </w:rPr>
+              <w:t>&lt;</w:t>
+            </w:r>
+            <w:r>
+              <w:rPr>
+                <w:sz w:val="18"/>
+              </w:rPr>
+              <w:t xml:space="preserve">, </w:t>
+            </w:r>
+            <w:r>
+              <w:rPr>
+                <w:rFonts w:ascii="Consolas" w:hAnsi="Consolas"/>
+                <w:sz w:val="18"/>
+              </w:rPr>
+              <w:t>&amp;</w:t>
+            </w:r>
+            <w:r>
+              <w:rPr>
+                <w:sz w:val="18"/>
+              </w:rPr>
+              <w:t xml:space="preserve">, </w:t>
+            </w:r>
+            <w:r>
+              <w:rPr>
+                <w:rFonts w:ascii="Consolas" w:hAnsi="Consolas"/>
+                <w:sz w:val="18"/>
+              </w:rPr>
+              <w:t>]]&gt;</w:t>
+            </w:r>
+            <w:r>
+              <w:rPr>
+                <w:sz w:val="18"/>
+              </w:rPr>
+              <w:t>, XML 1.0-illegal control characters, and unpaired surrogates</w:t>
             </w:r>
           </w:p>
         </w:tc>
@@ -12180,7 +13051,7 @@
               <w:rPr>
                 <w:sz w:val="18"/>
               </w:rPr>
-              <w:t>Escaped; file opens cleanly</w:t>
+              <w:t>Markup is escaped. Those control characters are stripped before the text is written. Unpaired surrogates do not survive as surrogates. The file opens cleanly (spike S-09).</w:t>
             </w:r>
           </w:p>
         </w:tc>
@@ -12508,6 +13379,11 @@
       <w:pPr>
         <w:spacing w:after="40"/>
       </w:pPr>
+    </w:p>
+    <w:p>
+      <w:r>
+        <w:t>H-01 to H-09 passed in spike S-08, under Node and in the Electron 45 utility process, on Windows image 20261021.278.1 and on Linux. Refused files were unchanged. The three bombs stopped at 25 MB, 20 MB, and 250 MB of real bytes. A 200-image yazl save was byte-identical when encoded twice in the same runtime.</w:t>
+      </w:r>
     </w:p>
     <w:p>
       <w:pPr>
@@ -12520,7 +13396,7 @@
     </w:p>
     <w:p>
       <w:r>
-        <w:t>Decisions are based on SRS 1.2. They are Proposed until accepted. ADR-010 and ADR-011 were accepted on October 23, 2026, and ADR-012 and ADR-013 on October 26, 2026. Structure: ADR-001. Failure handling: ADR-002.</w:t>
+        <w:t>Decisions are based on SRS 1.3. They are Proposed until accepted. ADR-010 and ADR-011 were accepted on October 23, 2026, and ADR-012 and ADR-013 on October 26, 2026. Structure: ADR-001. Failure handling: ADR-002.</w:t>
       </w:r>
     </w:p>
     <w:tbl>
@@ -12672,7 +13548,7 @@
               <w:rPr>
                 <w:sz w:val="19"/>
               </w:rPr>
-              <w:t>Save, Save As, and autosave share one save call and one atomic-write helper</w:t>
+              <w:t>Save, Save as, and autosave share one save call and one atomic-write helper</w:t>
             </w:r>
           </w:p>
         </w:tc>
@@ -12831,7 +13707,7 @@
               <w:rPr>
                 <w:sz w:val="19"/>
               </w:rPr>
-              <w:t>Formulas: KaTeX on screen and PDF, OMML for Word, image fallback</w:t>
+              <w:t>Equations: KaTeX on screen and PDF, OMML for Word, image fallback</w:t>
             </w:r>
           </w:p>
         </w:tc>
@@ -13566,7 +14442,7 @@
         <w:pStyle w:val="Heading2"/>
       </w:pPr>
       <w:r>
-        <w:t>ADR-002 Save, Save As, and autosave share one save call and one atomic-write helper</w:t>
+        <w:t>ADR-002 Save, Save as, and autosave share one save call and one atomic-write helper</w:t>
       </w:r>
     </w:p>
     <w:tbl>
@@ -13720,7 +14596,7 @@
               <w:rPr>
                 <w:sz w:val="20"/>
               </w:rPr>
-              <w:t>file:save checks the disk stat, then calls FileService.writeAtomic: an unpredictable temp name in the same folder, exclusive create, flush, one rename. Save, Save As, and the renderer's autosave timer all call file:save. Exports, recovery, signatures, and preferences use writeAtomic too.</w:t>
+              <w:t>file:save checks the disk stat, then calls FileService.writeAtomic: an unpredictable temp name in the same folder, exclusive create, flush, one rename. Save, Save as, and the renderer's autosave timer all call file:save. Exports, recovery, signatures, and preferences use writeAtomic too.</w:t>
             </w:r>
           </w:p>
         </w:tc>
@@ -14400,7 +15276,7 @@
         <w:pStyle w:val="Heading2"/>
       </w:pPr>
       <w:r>
-        <w:t>ADR-005 Formulas: KaTeX on screen and PDF, OMML for Word, image fallback</w:t>
+        <w:t>ADR-005 Equations: KaTeX on screen and PDF, OMML for Word, image fallback</w:t>
       </w:r>
     </w:p>
     <w:tbl>
@@ -14518,7 +15394,7 @@
               <w:rPr>
                 <w:sz w:val="20"/>
               </w:rPr>
-              <w:t>Formulas are the standout feature (FR-53). Word needs native equations (FR-57), but conversion may fail (FR-56).</w:t>
+              <w:t>Equations are the standout feature (FR-53). Word needs native equations (FR-57), but conversion may fail (FR-56).</w:t>
             </w:r>
           </w:p>
         </w:tc>
@@ -14554,7 +15430,7 @@
               <w:rPr>
                 <w:sz w:val="20"/>
               </w:rPr>
-              <w:t>KaTeX renders on screen and in PDF, with the fixed settings in section 6.4. For Word, KaTeX MathML goes through mathml2omml; on failure, or if not built, the formula is a PNG.</w:t>
+              <w:t>KaTeX renders on screen and in PDF, with the fixed settings in section 6.4. For Word, KaTeX MathML goes through mathml2omml; on failure, or if not built, the equation is a PNG.</w:t>
             </w:r>
           </w:p>
         </w:tc>
@@ -14626,7 +15502,20 @@
               <w:rPr>
                 <w:sz w:val="20"/>
               </w:rPr>
-              <w:t>Word export never fails because of a formula. Costs: an LGPL module (NFR-29) and possible fidelity gaps (R-01).</w:t>
+              <w:t xml:space="preserve">Word export never fails because of a formula. Costs: an LGPL module (NFR-29) and a small OMML cleanup before the equation is written (spike S-03). The sum's empty n-ary body, stretchy matrix fences, and a display </w:t>
+            </w:r>
+            <w:r>
+              <w:rPr>
+                <w:rFonts w:ascii="Consolas" w:hAnsi="Consolas"/>
+                <w:sz w:val="20"/>
+              </w:rPr>
+              <w:t>m:oMathPara</w:t>
+            </w:r>
+            <w:r>
+              <w:rPr>
+                <w:sz w:val="20"/>
+              </w:rPr>
+              <w:t xml:space="preserve"> wrap are that cleanup. Alignment is still unchecked.</w:t>
             </w:r>
           </w:p>
         </w:tc>
@@ -14662,7 +15551,7 @@
               <w:rPr>
                 <w:sz w:val="20"/>
               </w:rPr>
-              <w:t>mathml2omml fidelity is poor on the SRS samples.</w:t>
+              <w:t>the cleanup cannot be done, or a later alignment sample looks wrong in Word. A conversion that still fails uses the image fallback (FR-56).</w:t>
             </w:r>
           </w:p>
         </w:tc>
@@ -15110,7 +15999,33 @@
               <w:rPr>
                 <w:sz w:val="20"/>
               </w:rPr>
-              <w:t>SignatureStore keeps each signature as a PNG in its own file, encrypted with the async safeStorage API (OD-15). sig:list returns names only; sig:get decrypts one. Unavailable or temporarily unavailable: save and show nothing, delete nothing, say so.</w:t>
+              <w:t xml:space="preserve">SignatureStore keeps each signature as a PNG in its own file, encrypted with the async safeStorage API (OD-15). The sync methods are not used. sig:list returns names only; sig:get decrypts one. Check </w:t>
+            </w:r>
+            <w:r>
+              <w:rPr>
+                <w:rFonts w:ascii="Consolas" w:hAnsi="Consolas"/>
+                <w:sz w:val="20"/>
+              </w:rPr>
+              <w:t>isEncryptionAvailable</w:t>
+            </w:r>
+            <w:r>
+              <w:rPr>
+                <w:sz w:val="20"/>
+              </w:rPr>
+              <w:t xml:space="preserve"> before a save. Unavailable, a failed encrypt, or any failed decrypt: save and show nothing, delete nothing, say so. Spike S-07 did not produce the temporarily unavailable string, and </w:t>
+            </w:r>
+            <w:r>
+              <w:rPr>
+                <w:rFonts w:ascii="Consolas" w:hAnsi="Consolas"/>
+                <w:sz w:val="20"/>
+              </w:rPr>
+              <w:t>shouldReEncrypt</w:t>
+            </w:r>
+            <w:r>
+              <w:rPr>
+                <w:sz w:val="20"/>
+              </w:rPr>
+              <w:t xml:space="preserve"> was false.</w:t>
             </w:r>
           </w:p>
         </w:tc>
@@ -15666,7 +16581,20 @@
               <w:rPr>
                 <w:sz w:val="20"/>
               </w:rPr>
-              <w:t>Main takes the single-instance lock; a second launch passes its arguments through the second-instance event, and main keeps only .obk files. RecoveryService writes recovery copies through writeAtomic, named by UUIDs main makes; the renderer's timer sends them (OD-16).</w:t>
+              <w:t xml:space="preserve">Main takes the single-instance lock. A second launch passes its arguments through the </w:t>
+            </w:r>
+            <w:r>
+              <w:rPr>
+                <w:rFonts w:ascii="Consolas" w:hAnsi="Consolas"/>
+                <w:sz w:val="20"/>
+              </w:rPr>
+              <w:t>second-instance</w:t>
+            </w:r>
+            <w:r>
+              <w:rPr>
+                <w:sz w:val="20"/>
+              </w:rPr>
+              <w:t xml:space="preserve"> event. Main keeps only .obk files, picked out of argv by filtering. Several selected files are one event each. RecoveryService writes recovery copies through writeAtomic, named by UUIDs main makes; the renderer's timer sends them (OD-16).</w:t>
             </w:r>
           </w:p>
         </w:tc>
@@ -15738,7 +16666,46 @@
               <w:rPr>
                 <w:sz w:val="20"/>
               </w:rPr>
-              <w:t>One window, one place for recovery. Costs: the lock must release on crash, and the activation path needs an MSIX test (R-06).</w:t>
+              <w:t xml:space="preserve">One window, one place for recovery. The lock must release on crash. Checked in spike S-02 on 27 October 2026, Windows 11 Home 10.0.26300, Electron 45.0.0, commit 0f95f5f. A cold start and a second double-click both delivered the path, and one window stayed open. Open with and the app execution alias did too. Explorer's working directory was </w:t>
+            </w:r>
+            <w:r>
+              <w:rPr>
+                <w:rFonts w:ascii="Consolas" w:hAnsi="Consolas"/>
+                <w:sz w:val="20"/>
+              </w:rPr>
+              <w:t>C:\WINDOWS\System32</w:t>
+            </w:r>
+            <w:r>
+              <w:rPr>
+                <w:sz w:val="20"/>
+              </w:rPr>
+              <w:t xml:space="preserve">, so a relative path is not resolved against it. </w:t>
+            </w:r>
+            <w:r>
+              <w:rPr>
+                <w:rFonts w:ascii="Consolas" w:hAnsi="Consolas"/>
+                <w:sz w:val="20"/>
+              </w:rPr>
+              <w:t>GetActivatedEventArgs</w:t>
+            </w:r>
+            <w:r>
+              <w:rPr>
+                <w:sz w:val="20"/>
+              </w:rPr>
+              <w:t xml:space="preserve"> is not on Electron's </w:t>
+            </w:r>
+            <w:r>
+              <w:rPr>
+                <w:rFonts w:ascii="Consolas" w:hAnsi="Consolas"/>
+                <w:sz w:val="20"/>
+              </w:rPr>
+              <w:t>app</w:t>
+            </w:r>
+            <w:r>
+              <w:rPr>
+                <w:sz w:val="20"/>
+              </w:rPr>
+              <w:t xml:space="preserve"> object. The path was already on argv, so this design does not call it.</w:t>
             </w:r>
           </w:p>
         </w:tc>
@@ -15944,7 +16911,33 @@
               <w:rPr>
                 <w:sz w:val="20"/>
               </w:rPr>
-              <w:t>BlockViews sets Mermaid up once with securityLevel strict, startOnLoad false, htmlLabels false, and an extended secure list (section 6.4) (OD-19).</w:t>
+              <w:t xml:space="preserve">BlockViews sets Mermaid up once with securityLevel strict, startOnLoad false, htmlLabels false, layout dagre, and an extended secure list (section 6.4) (OD-19). Before render, </w:t>
+            </w:r>
+            <w:r>
+              <w:rPr>
+                <w:rFonts w:ascii="Consolas" w:hAnsi="Consolas"/>
+                <w:sz w:val="20"/>
+              </w:rPr>
+              <w:t>click</w:t>
+            </w:r>
+            <w:r>
+              <w:rPr>
+                <w:sz w:val="20"/>
+              </w:rPr>
+              <w:t xml:space="preserve"> lines and </w:t>
+            </w:r>
+            <w:r>
+              <w:rPr>
+                <w:rFonts w:ascii="Consolas" w:hAnsi="Consolas"/>
+                <w:sz w:val="20"/>
+              </w:rPr>
+              <w:t>href</w:t>
+            </w:r>
+            <w:r>
+              <w:rPr>
+                <w:sz w:val="20"/>
+              </w:rPr>
+              <w:t xml:space="preserve"> values are removed from the diagram source (APPROVED 27 October 2026). Before the SVG enters the page, style attributes move into one stylesheet, filtered and scoped as in section 6.4, and that sheet is allowed with a per-render nonce (spike S-04). elkjs is not shipped.</w:t>
             </w:r>
           </w:p>
         </w:tc>
@@ -16016,7 +17009,7 @@
               <w:rPr>
                 <w:sz w:val="20"/>
               </w:rPr>
-              <w:t>Labels are plain text and click handlers are off. Cost: some styling a diagram could set is ignored.</w:t>
+              <w:t>Labels are plain text. Click links are stripped before render, and click handlers stay off. Some styling a diagram could set is dropped by the allowlist. The layout is dagre, which is MIT.</w:t>
             </w:r>
           </w:p>
         </w:tc>
@@ -16475,7 +17468,7 @@
               <w:rPr>
                 <w:sz w:val="20"/>
               </w:rPr>
-              <w:t>Formulas become editable Word equations through mathml2omml (FR-57), or images when conversion is off or fails (FR-56).</w:t>
+              <w:t>Equations become editable Word equations through mathml2omml (FR-57), or images when conversion is off or fails (FR-56).</w:t>
             </w:r>
           </w:p>
           <w:p>
@@ -16546,7 +17539,7 @@
               <w:rPr>
                 <w:sz w:val="20"/>
               </w:rPr>
-              <w:t xml:space="preserve"> package (MIT; 9.14.0 tested). It runs in main under Node.</w:t>
+              <w:t xml:space="preserve"> package (MIT; 9.14.0, checked in spike S-09). It runs in main under Node.</w:t>
             </w:r>
           </w:p>
           <w:p>
@@ -16557,7 +17550,7 @@
               <w:rPr>
                 <w:sz w:val="20"/>
               </w:rPr>
-              <w:t xml:space="preserve">OMML from mathml2omml goes into a paragraph through </w:t>
+              <w:t xml:space="preserve">OMML goes into a paragraph through </w:t>
             </w:r>
             <w:r>
               <w:rPr>
@@ -16570,7 +17563,46 @@
               <w:rPr>
                 <w:sz w:val="20"/>
               </w:rPr>
-              <w:t>.</w:t>
+              <w:t xml:space="preserve">. In docx 9.14.0 that call returns the document node. Inserting the node writes an element named </w:t>
+            </w:r>
+            <w:r>
+              <w:rPr>
+                <w:rFonts w:ascii="Consolas" w:hAnsi="Consolas"/>
+                <w:sz w:val="20"/>
+              </w:rPr>
+              <w:t>undefined</w:t>
+            </w:r>
+            <w:r>
+              <w:rPr>
+                <w:sz w:val="20"/>
+              </w:rPr>
+              <w:t xml:space="preserve">, and Word refuses the file. The </w:t>
+            </w:r>
+            <w:r>
+              <w:rPr>
+                <w:rFonts w:ascii="Consolas" w:hAnsi="Consolas"/>
+                <w:sz w:val="20"/>
+              </w:rPr>
+              <w:t>m:oMath</w:t>
+            </w:r>
+            <w:r>
+              <w:rPr>
+                <w:sz w:val="20"/>
+              </w:rPr>
+              <w:t xml:space="preserve"> child is what goes in the paragraph. Display equations are wrapped in </w:t>
+            </w:r>
+            <w:r>
+              <w:rPr>
+                <w:rFonts w:ascii="Consolas" w:hAnsi="Consolas"/>
+                <w:sz w:val="20"/>
+              </w:rPr>
+              <w:t>m:oMathPara</w:t>
+            </w:r>
+            <w:r>
+              <w:rPr>
+                <w:sz w:val="20"/>
+              </w:rPr>
+              <w:t xml:space="preserve"> after conversion (spike S-03 and spike S-09).</w:t>
             </w:r>
           </w:p>
         </w:tc>
@@ -16708,7 +17740,33 @@
               <w:rPr>
                 <w:sz w:val="20"/>
               </w:rPr>
-              <w:t>Word fidelity is checked by hand in Word (spike S-09).</w:t>
+              <w:t xml:space="preserve">Checked in spike S-09 (docx 9.14.0) in Microsoft 365, Version 2610, on Windows. Pass. The Export reference samples opened and matched the rows. The six equation samples were editable equations with conversion on, and images with conversion off. Image alt text showed in the Alt Text pane. A 50-page Letter file packed in under 10 seconds with no network call. The exporter sets Letter itself, because the library's default page is A4. It sets the document font and the table widths. It inserts the </w:t>
+            </w:r>
+            <w:r>
+              <w:rPr>
+                <w:rFonts w:ascii="Consolas" w:hAnsi="Consolas"/>
+                <w:sz w:val="20"/>
+              </w:rPr>
+              <w:t>m:oMath</w:t>
+            </w:r>
+            <w:r>
+              <w:rPr>
+                <w:sz w:val="20"/>
+              </w:rPr>
+              <w:t xml:space="preserve"> child, not the </w:t>
+            </w:r>
+            <w:r>
+              <w:rPr>
+                <w:rFonts w:ascii="Consolas" w:hAnsi="Consolas"/>
+                <w:sz w:val="20"/>
+              </w:rPr>
+              <w:t>fromXmlString</w:t>
+            </w:r>
+            <w:r>
+              <w:rPr>
+                <w:sz w:val="20"/>
+              </w:rPr>
+              <w:t xml:space="preserve"> return value. It drops XML 1.0-illegal control characters before the text is written. Unpaired surrogates do not survive as surrogates. Exported pictures are cropped to their content, with a small margin, and rendered at 2× or more. Checklist checkboxes have an option: a read-only Segoe UI Symbol mark, or a clickable Word checkbox content control. mathml2omml fidelity stays with spike S-03.</w:t>
             </w:r>
           </w:p>
         </w:tc>
@@ -16744,7 +17802,7 @@
               <w:rPr>
                 <w:sz w:val="20"/>
               </w:rPr>
-              <w:t>docx fails spike S-09, stops being maintained, or cannot write a block the Export reference needs.</w:t>
+              <w:t>docx stops being maintained, or it cannot write a block the Export reference needs.</w:t>
             </w:r>
           </w:p>
         </w:tc>
@@ -16911,7 +17969,7 @@
               <w:rPr>
                 <w:sz w:val="20"/>
               </w:rPr>
-              <w:t>Decoding may move to a sandboxed utilityProcess (R-08, spike S-08).</w:t>
+              <w:t>Decoding runs in a utilityProcess. Spike S-08 found that an Electron 45 utilityProcess is not OS-sandboxed. The hostile-file checks and the real-byte caps are the defence. APPROVED 27 October 2026: that process stays. The main-process fallback is not taken.</w:t>
             </w:r>
           </w:p>
         </w:tc>
@@ -16947,66 +18005,20 @@
               <w:rPr>
                 <w:sz w:val="20"/>
               </w:rPr>
-              <w:t xml:space="preserve">FormatCodec reads .obk files with </w:t>
+              <w:t xml:space="preserve">FormatCodec reads .obk files with yauzl (3.4.0, MIT) and writes them with yazl (3.3.1, MIT). Types come from DefinitelyTyped. yauzl reads the central directory first. </w:t>
             </w:r>
             <w:r>
               <w:rPr>
                 <w:rFonts w:ascii="Consolas" w:hAnsi="Consolas"/>
                 <w:sz w:val="20"/>
               </w:rPr>
-              <w:t>yauzl</w:t>
+              <w:t>validateEntrySizes</w:t>
             </w:r>
             <w:r>
               <w:rPr>
                 <w:sz w:val="20"/>
               </w:rPr>
-              <w:t xml:space="preserve"> (3.4.0, MIT) and writes them with </w:t>
-            </w:r>
-            <w:r>
-              <w:rPr>
-                <w:rFonts w:ascii="Consolas" w:hAnsi="Consolas"/>
-                <w:sz w:val="20"/>
-              </w:rPr>
-              <w:t>yazl</w:t>
-            </w:r>
-            <w:r>
-              <w:rPr>
-                <w:sz w:val="20"/>
-              </w:rPr>
-              <w:t xml:space="preserve"> (3.3.1, MIT). Types come from DefinitelyTyped.</w:t>
-            </w:r>
-          </w:p>
-          <w:p>
-            <w:pPr>
-              <w:spacing w:after="40"/>
-            </w:pPr>
-            <w:r>
-              <w:rPr>
-                <w:sz w:val="20"/>
-              </w:rPr>
-              <w:t>yauzl reads the central directory first, so names and declared sizes are known before anything is inflated.</w:t>
-            </w:r>
-          </w:p>
-          <w:p>
-            <w:pPr>
-              <w:spacing w:after="40"/>
-            </w:pPr>
-            <w:r>
-              <w:rPr>
-                <w:sz w:val="20"/>
-              </w:rPr>
-              <w:t>It errors when the real bytes pass the declared size, refuses ../ and absolute paths by default, and never writes to disk.</w:t>
-            </w:r>
-          </w:p>
-          <w:p>
-            <w:pPr>
-              <w:spacing w:after="40"/>
-            </w:pPr>
-            <w:r>
-              <w:rPr>
-                <w:sz w:val="20"/>
-              </w:rPr>
-              <w:t>yazl writes with a fixed modified time, so the same document gives the same bytes.</w:t>
+              <w:t xml:space="preserve"> is off. FormatCodec counts inflated bytes and stops at the 25 MB, 20 MB, and 250 MB caps, so a bomb that claims a tiny size is still stopped at the cap. An entry that finishes under the cap but does not match its declared size is refused. Names are checked by FormatCodec, not by yauzl's rewrite: the allowlist, dot-dot, a leading slash, a backslash, drive letters, network paths, stream suffixes, device names, and case duplicates. yauzl never writes the file it is reading. yazl writes with a fixed modified time, so two saves of the same document in one runtime give the same bytes. Spike S-08 checked a 200-image document.</w:t>
             </w:r>
           </w:p>
         </w:tc>
@@ -17111,29 +18123,7 @@
               <w:rPr>
                 <w:sz w:val="20"/>
               </w:rPr>
-              <w:t>Our own checks are still needed for the name allowlist, case duplicates, encrypted entries, and headers that disagree (H-03, H-06, H-07).</w:t>
-            </w:r>
-          </w:p>
-          <w:p>
-            <w:pPr>
-              <w:spacing w:after="40"/>
-            </w:pPr>
-            <w:r>
-              <w:rPr>
-                <w:sz w:val="20"/>
-              </w:rPr>
-              <w:t>yauzl's callback API is wrapped in a small promise helper inside FormatCodec.</w:t>
-            </w:r>
-          </w:p>
-          <w:p>
-            <w:pPr>
-              <w:spacing w:after="40"/>
-            </w:pPr>
-            <w:r>
-              <w:rPr>
-                <w:sz w:val="20"/>
-              </w:rPr>
-              <w:t>yazl's last release was November 2024. It is small and stable, but worth watching.</w:t>
+              <w:t>Our own checks are still needed, and S-08 is where they passed, including H-01 to H-09. yauzl's callback API is wrapped in a small promise helper inside FormatCodec. yazl's last release was November 2024. It is small and stable, but worth watching. The utility process is not an OS sandbox.</w:t>
             </w:r>
           </w:p>
         </w:tc>
@@ -17169,7 +18159,7 @@
               <w:rPr>
                 <w:sz w:val="20"/>
               </w:rPr>
-              <w:t>Either package is abandoned or has an unfixed security issue, spike S-08 fails, or format version 2 needs features they lack.</w:t>
+              <w:t>Either package is abandoned or has an unfixed security issue, or format version 2 needs features they lack. The main-process fallback was considered and is not taken (APPROVED 27 October 2026).</w:t>
             </w:r>
           </w:p>
         </w:tc>
@@ -17335,7 +18325,7 @@
               <w:rPr>
                 <w:sz w:val="18"/>
               </w:rPr>
-              <w:t>mathml2omml output differs from KaTeX for some formulas</w:t>
+              <w:t>mathml2omml output differs from KaTeX for some equations</w:t>
             </w:r>
           </w:p>
         </w:tc>
@@ -17386,7 +18376,7 @@
               <w:rPr>
                 <w:sz w:val="18"/>
               </w:rPr>
-              <w:t>Test the SRS formula samples in Word early; the image fallback covers failures (FR-56)</w:t>
+              <w:t>Test the SRS equation samples in Word early; the image fallback covers failures (FR-56)</w:t>
             </w:r>
           </w:p>
         </w:tc>
@@ -17906,7 +18896,20 @@
               <w:rPr>
                 <w:sz w:val="18"/>
               </w:rPr>
-              <w:t>Spikes S-01 and S-02 in a packaged build before the file features are built</w:t>
+              <w:t xml:space="preserve">Spike S-01 passed. Documents (OneDrive) and a local folder were not redirected, and the rename replaced the file in one step. Spike S-02 passed. A double-clicked file arrived on argv, and a second file arrived through </w:t>
+            </w:r>
+            <w:r>
+              <w:rPr>
+                <w:rFonts w:ascii="Consolas" w:hAnsi="Consolas"/>
+                <w:sz w:val="18"/>
+              </w:rPr>
+              <w:t>second-instance</w:t>
+            </w:r>
+            <w:r>
+              <w:rPr>
+                <w:sz w:val="18"/>
+              </w:rPr>
+              <w:t>. Both on Windows 11 Home 10.0.26300, Electron 45.0.0.</w:t>
             </w:r>
           </w:p>
         </w:tc>
@@ -18010,7 +19013,7 @@
               <w:rPr>
                 <w:sz w:val="18"/>
               </w:rPr>
-              <w:t>Retry 3 times at 100 ms, then report; never leave a partial file (NFR-10)</w:t>
+              <w:t>Retry EPERM, EBUSY, and EACCES three times, 100 ms apart, then report. A read-only file and a file another program has open both returned EPERM. The old file stayed. Never leave a partial file (NFR-10). Checked in spike S-01.</w:t>
             </w:r>
           </w:p>
         </w:tc>
@@ -18114,7 +19117,7 @@
               <w:rPr>
                 <w:sz w:val="18"/>
               </w:rPr>
-              <w:t>Sandbox and policy (section 6.4); main refuses what it did not issue; security releases within 30 days (QS-07)</w:t>
+              <w:t>The renderer stays sandboxed (section 6.4). Spike S-08 found that the utility process which decodes .obk files is not OS-sandboxed in Electron 45. A hostile archive is stopped by the section 6.6 checks, which passed for H-01 to H-09, not by a sandbox on that process. Main refuses what it did not issue. Security releases ship within 30 days (QS-07).</w:t>
             </w:r>
           </w:p>
         </w:tc>
@@ -18297,7 +19300,7 @@
               <w:rPr>
                 <w:sz w:val="18"/>
               </w:rPr>
-              <w:t>UNVERIFIED (45 or later)</w:t>
+              <w:t>45.0.0</w:t>
             </w:r>
           </w:p>
         </w:tc>
@@ -18314,7 +19317,7 @@
               <w:rPr>
                 <w:sz w:val="18"/>
               </w:rPr>
-              <w:t>Chromium layout and printToPDF; one codebase</w:t>
+              <w:t>Chromium layout and printToPDF; one codebase. Spikes S-01 to S-09 ran on this version (Chrome 156.0.8078.48, Node 24.22.0 inside Electron).</w:t>
             </w:r>
           </w:p>
         </w:tc>
@@ -18558,7 +19561,7 @@
               <w:rPr>
                 <w:sz w:val="18"/>
               </w:rPr>
-              <w:t>UNVERIFIED</w:t>
+              <w:t>0.19.1 (checked in S-03 and S-04); pin when equations are built</w:t>
             </w:r>
           </w:p>
         </w:tc>
@@ -18645,7 +19648,7 @@
               <w:rPr>
                 <w:sz w:val="18"/>
               </w:rPr>
-              <w:t>0.5.0 (npm)</w:t>
+              <w:t>0.5.0 (checked in S-03)</w:t>
             </w:r>
           </w:p>
         </w:tc>
@@ -18732,7 +19735,7 @@
               <w:rPr>
                 <w:sz w:val="18"/>
               </w:rPr>
-              <w:t>9.14.0 (tested); pin at implementation</w:t>
+              <w:t>9.14.0 (checked in S-09)</w:t>
             </w:r>
           </w:p>
         </w:tc>
@@ -18889,7 +19892,7 @@
               <w:rPr>
                 <w:sz w:val="18"/>
               </w:rPr>
-              <w:t>Mermaid, securityLevel strict</w:t>
+              <w:t>Mermaid, securityLevel strict, dagre layout</w:t>
             </w:r>
           </w:p>
         </w:tc>
@@ -18906,7 +19909,7 @@
               <w:rPr>
                 <w:sz w:val="18"/>
               </w:rPr>
-              <w:t>UNVERIFIED</w:t>
+              <w:t>12.2.0 (checked in spike S-04); pin when diagrams are built</w:t>
             </w:r>
           </w:p>
         </w:tc>
@@ -18923,7 +19926,7 @@
               <w:rPr>
                 <w:sz w:val="18"/>
               </w:rPr>
-              <w:t>Text diagrams, offline</w:t>
+              <w:t>Text diagrams, offline, with the style post-process in section 6.4. No ELK layout.</w:t>
             </w:r>
           </w:p>
         </w:tc>
@@ -18940,7 +19943,7 @@
               <w:rPr>
                 <w:sz w:val="18"/>
               </w:rPr>
-              <w:t>MIT (UNVERIFIED)</w:t>
+              <w:t>MIT for 12.2.0 and for dagre. elkjs is not shipped (APPROVED 27 October 2026). Mermaid still uses DOMPurify 3.4.17 (MPL-2.0 OR Apache-2.0).</w:t>
             </w:r>
           </w:p>
         </w:tc>
@@ -18993,7 +19996,7 @@
               <w:rPr>
                 <w:sz w:val="18"/>
               </w:rPr>
-              <w:t>3.4.0 + 3.3.1</w:t>
+              <w:t>3.4.0 + 3.3.1 (checked in S-08)</w:t>
             </w:r>
           </w:p>
         </w:tc>
@@ -19211,6 +20214,11 @@
       <w:pPr>
         <w:spacing w:after="40"/>
       </w:pPr>
+    </w:p>
+    <w:p>
+      <w:r>
+        <w:t>JSZip is brought in by docx. S-03 saw 3.10.1 and S-09 saw 3.10.2. Both are used under MIT, chosen from the MIT or GPLv3 dual license. This draft does not pin a JSZip version of its own. hash.js 1.1.7 and nanoid 6.0.2, also under docx, are MIT (S-09).</w:t>
+      </w:r>
     </w:p>
     <w:p>
       <w:r>
@@ -19221,7 +20229,7 @@
         <w:t xml:space="preserve">UNVERIFIED: </w:t>
       </w:r>
       <w:r>
-        <w:t>Versions and licenses still marked UNVERIFIED. The Word math, Word file, and ZIP rows were checked on npm. Fix the rest after the spikes below, from each project's package page.</w:t>
+        <w:t>React, TypeScript, the editor core, the test runner, and the MSIX tooling are still unmarked. Electron, KaTeX, Mermaid, mathml2omml, docx, yauzl, and yazl are the versions above. elkjs is not shipped (APPROVED 27 October 2026).</w:t>
       </w:r>
     </w:p>
     <w:p>
@@ -19328,7 +20336,7 @@
               <w:rPr>
                 <w:sz w:val="19"/>
               </w:rPr>
-              <w:t>In a packaged MSIX build, save to Documents and confirm the write is not redirected and the rename replaces the file in one step.</w:t>
+              <w:t>Checked, pass, 27 October 2026, commit 8f4c177, Electron 45.0.0, Windows 11 Home 10.0.26300. Documents (OneDrive) and the local Desktop were not redirected. The rename replaced the file in one step.</w:t>
             </w:r>
           </w:p>
         </w:tc>
@@ -19381,7 +20389,20 @@
               <w:rPr>
                 <w:sz w:val="19"/>
               </w:rPr>
-              <w:t>Double-click an .obk file with Obelisk running; confirm the path arrives through the second-instance event.</w:t>
+              <w:t xml:space="preserve">Checked, pass, 27 October 2026, commit 0f95f5f, Electron 45.0.0, Windows 11 Home 10.0.26300. The path arrived on argv for a cold start, and through </w:t>
+            </w:r>
+            <w:r>
+              <w:rPr>
+                <w:rFonts w:ascii="Consolas" w:hAnsi="Consolas"/>
+                <w:sz w:val="19"/>
+              </w:rPr>
+              <w:t>second-instance</w:t>
+            </w:r>
+            <w:r>
+              <w:rPr>
+                <w:sz w:val="19"/>
+              </w:rPr>
+              <w:t xml:space="preserve"> when the app was already running.</w:t>
             </w:r>
           </w:p>
         </w:tc>
@@ -19434,7 +20455,7 @@
               <w:rPr>
                 <w:sz w:val="19"/>
               </w:rPr>
-              <w:t>Convert the SRS formula samples with mathml2omml and open them in Word.</w:t>
+              <w:t>Checked, pass with a condition. Package checks: commit 42279f4, CI run 40527700478. Word: Microsoft 365 Version 2610 on a Windows desktop, 27 October 2026, not the CI runner. The six samples were editable. The exporter cleans the OMML as in ADR-005. Alignment is still unchecked.</w:t>
             </w:r>
           </w:p>
         </w:tc>
@@ -19487,7 +20508,33 @@
               <w:rPr>
                 <w:sz w:val="19"/>
               </w:rPr>
-              <w:t>Render a Mermaid flowchart at securityLevel strict in a sandboxed renderer with the network off, and find the style-src KaTeX and Mermaid output need.</w:t>
+              <w:t xml:space="preserve">Checked, pass, Electron 45.0.0, Mermaid 12.2.0, KaTeX 0.19.1. Sizes from CI run 40464232909 (commit 912eabd); the allowlist is in the merged note (commit 5db8131). Strict mode rendered offline. The readable path is the post-process and a per-render style nonce. APPROVED 27 October 2026: dagre layout, no elkjs, and </w:t>
+            </w:r>
+            <w:r>
+              <w:rPr>
+                <w:rFonts w:ascii="Consolas" w:hAnsi="Consolas"/>
+                <w:sz w:val="19"/>
+              </w:rPr>
+              <w:t>click</w:t>
+            </w:r>
+            <w:r>
+              <w:rPr>
+                <w:sz w:val="19"/>
+              </w:rPr>
+              <w:t xml:space="preserve"> and </w:t>
+            </w:r>
+            <w:r>
+              <w:rPr>
+                <w:rFonts w:ascii="Consolas" w:hAnsi="Consolas"/>
+                <w:sz w:val="19"/>
+              </w:rPr>
+              <w:t>href</w:t>
+            </w:r>
+            <w:r>
+              <w:rPr>
+                <w:sz w:val="19"/>
+              </w:rPr>
+              <w:t xml:space="preserve"> are stripped before render.</w:t>
             </w:r>
           </w:p>
         </w:tc>
@@ -19540,7 +20587,7 @@
               <w:rPr>
                 <w:sz w:val="19"/>
               </w:rPr>
-              <w:t>Confirm whether the Windows Save dialog asks before replacing a file, as Electron sets it.</w:t>
+              <w:t>Checked, pass, 27 October 2026, Electron 45.0.0, Windows 11 Home 10.0.26300, commit 7ea3b12. The native prompt is the FR-12 confirmation on Windows. Obelisk does not ask again.</w:t>
             </w:r>
           </w:p>
         </w:tc>
@@ -19593,7 +20640,7 @@
               <w:rPr>
                 <w:sz w:val="19"/>
               </w:rPr>
-              <w:t>Count frames and read frame sizes of animated GIF and WebP files without decoding, and make a first-frame PNG in the renderer.</w:t>
+              <w:t>Checked, pass, Electron 45.0.0, CI run 40461995542, Windows image 20261021.278.1 and Ubuntu image 20261023.334.3. Frame counts come from a container walk. The first-frame PNG is made in the sandboxed renderer.</w:t>
             </w:r>
           </w:p>
         </w:tc>
@@ -19646,7 +20693,7 @@
               <w:rPr>
                 <w:sz w:val="19"/>
               </w:rPr>
-              <w:t>In a packaged MSIX build, encrypt and decrypt a signature with the async safeStorage API, and force the unavailable and re-encrypt states.</w:t>
+              <w:t>Checked, pass, 27 October 2026, commit a9f8119, Electron 45.0.0, Windows 11 Home 10.0.26300. The async API round-tripped in the MSIX, including after a restart. shouldReEncrypt was false. A bad key is a generic decrypt error, so any decrypt failure means the signature is unavailable.</w:t>
             </w:r>
           </w:p>
         </w:tc>
@@ -19699,51 +20746,7 @@
               <w:rPr>
                 <w:sz w:val="19"/>
               </w:rPr>
-              <w:t>Decode .obk files in a sandboxed Electron utilityProcess instead of main. Run FormatCodec on yauzl and yazl under Node and inside an Electron 45 utilityProcess:</w:t>
-            </w:r>
-          </w:p>
-          <w:p>
-            <w:pPr>
-              <w:spacing w:after="40"/>
-            </w:pPr>
-            <w:r>
-              <w:rPr>
-                <w:sz w:val="19"/>
-              </w:rPr>
-              <w:t>Hostile samples H-01 to H-09 are refused, including a bomb with a forged small size, stopped at the 25 MB, 20 MB, and 250 MB real-byte caps.</w:t>
-            </w:r>
-          </w:p>
-          <w:p>
-            <w:pPr>
-              <w:spacing w:after="40"/>
-            </w:pPr>
-            <w:r>
-              <w:rPr>
-                <w:sz w:val="19"/>
-              </w:rPr>
-              <w:t>Bad names are refused: ../, a leading slash, a backslash, drive letters, network paths, stream suffixes, CON, and case duplicates.</w:t>
-            </w:r>
-          </w:p>
-          <w:p>
-            <w:pPr>
-              <w:spacing w:after="40"/>
-            </w:pPr>
-            <w:r>
-              <w:rPr>
-                <w:sz w:val="19"/>
-              </w:rPr>
-              <w:t>Saving a 200-image document twice gives byte-identical files.</w:t>
-            </w:r>
-          </w:p>
-          <w:p>
-            <w:pPr>
-              <w:spacing w:after="40"/>
-            </w:pPr>
-            <w:r>
-              <w:rPr>
-                <w:sz w:val="19"/>
-              </w:rPr>
-              <w:t>Each refused file stays unchanged (FR-09).</w:t>
+              <w:t>Checked, partial on the OS sandbox, Electron 45.0.0, yauzl 3.4.0, yazl 3.3.1, Windows image 20261021.278.1. H-01 to H-09, the real-byte caps, the name rules, the byte-identical 200-image save, and unchanged refused files all passed. The utility process is not OS-sandboxed. ADR-013 stays. APPROVED 27 October 2026: the main-process fallback is not taken.</w:t>
             </w:r>
           </w:p>
         </w:tc>
@@ -19796,101 +20799,7 @@
               <w:rPr>
                 <w:sz w:val="19"/>
               </w:rPr>
-              <w:t>Export with docx and open the results in current Word for Windows:</w:t>
-            </w:r>
-          </w:p>
-          <w:p>
-            <w:pPr>
-              <w:spacing w:after="40"/>
-            </w:pPr>
-            <w:r>
-              <w:rPr>
-                <w:sz w:val="19"/>
-              </w:rPr>
-              <w:t>The formula samples stay editable with conversion on (AC-11), and appear as images with conversion off.</w:t>
-            </w:r>
-          </w:p>
-          <w:p>
-            <w:pPr>
-              <w:spacing w:after="40"/>
-            </w:pPr>
-            <w:r>
-              <w:rPr>
-                <w:sz w:val="19"/>
-              </w:rPr>
-              <w:t>Each Export reference row opens cleanly in Word.</w:t>
-            </w:r>
-          </w:p>
-          <w:p>
-            <w:pPr>
-              <w:spacing w:after="40"/>
-            </w:pPr>
-            <w:r>
-              <w:rPr>
-                <w:sz w:val="19"/>
-              </w:rPr>
-              <w:t>Image alt text shows in Word's Alt Text pane.</w:t>
-            </w:r>
-          </w:p>
-          <w:p>
-            <w:pPr>
-              <w:spacing w:after="40"/>
-            </w:pPr>
-            <w:r>
-              <w:rPr>
-                <w:sz w:val="19"/>
-              </w:rPr>
-              <w:t>Hostile text (</w:t>
-            </w:r>
-            <w:r>
-              <w:rPr>
-                <w:rFonts w:ascii="Consolas" w:hAnsi="Consolas"/>
-                <w:sz w:val="19"/>
-              </w:rPr>
-              <w:t>&lt;</w:t>
-            </w:r>
-            <w:r>
-              <w:rPr>
-                <w:sz w:val="19"/>
-              </w:rPr>
-              <w:t xml:space="preserve">, </w:t>
-            </w:r>
-            <w:r>
-              <w:rPr>
-                <w:rFonts w:ascii="Consolas" w:hAnsi="Consolas"/>
-                <w:sz w:val="19"/>
-              </w:rPr>
-              <w:t>&amp;</w:t>
-            </w:r>
-            <w:r>
-              <w:rPr>
-                <w:sz w:val="19"/>
-              </w:rPr>
-              <w:t xml:space="preserve">, </w:t>
-            </w:r>
-            <w:r>
-              <w:rPr>
-                <w:rFonts w:ascii="Consolas" w:hAnsi="Consolas"/>
-                <w:sz w:val="19"/>
-              </w:rPr>
-              <w:t>]]&gt;</w:t>
-            </w:r>
-            <w:r>
-              <w:rPr>
-                <w:sz w:val="19"/>
-              </w:rPr>
-              <w:t>, control characters, unpaired surrogates) stays text, not markup (H-26).</w:t>
-            </w:r>
-          </w:p>
-          <w:p>
-            <w:pPr>
-              <w:spacing w:after="40"/>
-            </w:pPr>
-            <w:r>
-              <w:rPr>
-                <w:sz w:val="19"/>
-              </w:rPr>
-              <w:t>A large export finishes in under 10 seconds with no network calls (NFR-04).</w:t>
+              <w:t>Checked, pass, docx 9.14.0. Word rounds were Microsoft 365 Version 2610. ADR-012 is kept. The exporter strips XML-illegal control characters, inserts the m:oMath child, sets Letter and the table widths, crops exported pictures, and offers a checkbox choice. The 50-page pack on the spike machine was under 10 seconds with no network call. CI run 40522475439 packed an earlier file, also under 10 seconds and with no network call.</w:t>
             </w:r>
           </w:p>
         </w:tc>
@@ -23820,7 +24729,7 @@
               <w:rPr>
                 <w:sz w:val="18"/>
               </w:rPr>
-              <w:t>EditorCore</w:t>
+              <w:t>EditorCore, Link opener</w:t>
             </w:r>
           </w:p>
         </w:tc>
@@ -27648,7 +28557,7 @@
               <w:rPr>
                 <w:sz w:val="18"/>
               </w:rPr>
-              <w:t>Build and release</w:t>
+              <w:t>Link opener</w:t>
             </w:r>
           </w:p>
         </w:tc>
@@ -27735,7 +28644,7 @@
               <w:rPr>
                 <w:sz w:val="18"/>
               </w:rPr>
-              <w:t>ClipboardBridge</w:t>
+              <w:t>ClipboardBridge, Link opener</w:t>
             </w:r>
           </w:p>
         </w:tc>
@@ -30824,7 +31733,33 @@
               <w:rPr>
                 <w:sz w:val="19"/>
               </w:rPr>
-              <w:t>Mermaid, bundled, offline; license to verify</w:t>
+              <w:t xml:space="preserve">Mermaid 12.2.0, bundled, offline, dagre layout (MIT). No elkjs. Style post-process and per-render nonce from spike S-04. </w:t>
+            </w:r>
+            <w:r>
+              <w:rPr>
+                <w:rFonts w:ascii="Consolas" w:hAnsi="Consolas"/>
+                <w:sz w:val="19"/>
+              </w:rPr>
+              <w:t>click</w:t>
+            </w:r>
+            <w:r>
+              <w:rPr>
+                <w:sz w:val="19"/>
+              </w:rPr>
+              <w:t xml:space="preserve"> and </w:t>
+            </w:r>
+            <w:r>
+              <w:rPr>
+                <w:rFonts w:ascii="Consolas" w:hAnsi="Consolas"/>
+                <w:sz w:val="19"/>
+              </w:rPr>
+              <w:t>href</w:t>
+            </w:r>
+            <w:r>
+              <w:rPr>
+                <w:sz w:val="19"/>
+              </w:rPr>
+              <w:t xml:space="preserve"> are stripped before render.</w:t>
             </w:r>
           </w:p>
         </w:tc>
@@ -30841,7 +31776,7 @@
               <w:rPr>
                 <w:sz w:val="19"/>
               </w:rPr>
-              <w:t>Open</w:t>
+              <w:t>Decided 2026-10-27. APPROVED 27 October 2026.</w:t>
             </w:r>
           </w:p>
         </w:tc>
@@ -31885,7 +32820,7 @@
               <w:rPr>
                 <w:sz w:val="19"/>
               </w:rPr>
-              <w:t>1.2, October 26, 2026</w:t>
+              <w:t>1.3, October 27, 2026</w:t>
             </w:r>
           </w:p>
         </w:tc>
@@ -31921,7 +32856,7 @@
               <w:rPr>
                 <w:sz w:val="19"/>
               </w:rPr>
-              <w:t>SRS version 1.2</w:t>
+              <w:t>SRS version 1.3</w:t>
             </w:r>
           </w:p>
         </w:tc>
@@ -32054,7 +32989,7 @@
         <w:spacing w:after="60"/>
       </w:pPr>
       <w:r>
-        <w:t>Obelisk SRS (Plong_Obelisk_SRS.docx), version 1.2.</w:t>
+        <w:t>Obelisk SRS (Plong_Obelisk_SRS.docx), version 1.3.</w:t>
       </w:r>
     </w:p>
     <w:p>

</xml_diff>